<commit_message>
updated infographic presentation prep
</commit_message>
<xml_diff>
--- a/Infographic_Prep/Infographic_Presentation_Prep.docx
+++ b/Infographic_Prep/Infographic_Presentation_Prep.docx
@@ -666,6 +666,26 @@
     </w:p>
     <w:p>
       <w:pPr>
+        <w:spacing w:after="160" w:line="278" w:lineRule="auto"/>
+        <w:rPr>
+          <w:rFonts w:ascii="Cambria Math" w:hAnsi="Cambria Math"/>
+          <w:b/>
+          <w:bCs/>
+          <w:color w:val="273540"/>
+        </w:rPr>
+      </w:pPr>
+      <w:r>
+        <w:rPr>
+          <w:rFonts w:ascii="Cambria Math" w:hAnsi="Cambria Math"/>
+          <w:b/>
+          <w:bCs/>
+          <w:color w:val="273540"/>
+        </w:rPr>
+        <w:br w:type="page"/>
+      </w:r>
+    </w:p>
+    <w:p>
+      <w:pPr>
         <w:pStyle w:val="ListParagraph"/>
         <w:numPr>
           <w:ilvl w:val="3"/>
@@ -695,6 +715,7 @@
           <w:kern w:val="0"/>
           <w14:ligatures w14:val="none"/>
         </w:rPr>
+        <w:lastRenderedPageBreak/>
         <w:t>Definitions of any specialized terms or summaries of concepts related to the field someone from this class may not be familiar with. The only undefined terms may be terms from this class and its prerequisites.</w:t>
       </w:r>
     </w:p>
@@ -1022,7 +1043,6 @@
           <w:color w:val="273540"/>
           <w:u w:val="single"/>
         </w:rPr>
-        <w:lastRenderedPageBreak/>
         <w:t>FRL</w:t>
       </w:r>
       <w:r>
@@ -1168,6 +1188,26 @@
           <w:color w:val="273540"/>
         </w:rPr>
         <w:br/>
+      </w:r>
+    </w:p>
+    <w:p>
+      <w:pPr>
+        <w:spacing w:after="160" w:line="278" w:lineRule="auto"/>
+        <w:rPr>
+          <w:rFonts w:ascii="Cambria Math" w:hAnsi="Cambria Math"/>
+          <w:b/>
+          <w:bCs/>
+          <w:color w:val="273540"/>
+        </w:rPr>
+      </w:pPr>
+      <w:r>
+        <w:rPr>
+          <w:rFonts w:ascii="Cambria Math" w:hAnsi="Cambria Math"/>
+          <w:b/>
+          <w:bCs/>
+          <w:color w:val="273540"/>
+        </w:rPr>
+        <w:br w:type="page"/>
       </w:r>
     </w:p>
     <w:p>
@@ -1195,6 +1235,7 @@
           <w:bCs/>
           <w:color w:val="273540"/>
         </w:rPr>
+        <w:lastRenderedPageBreak/>
         <w:t>Answer to the research question and solution of the linear system (or linear algebra-related mathematical model or claim)</w:t>
       </w:r>
     </w:p>
@@ -2699,6 +2740,26 @@
     </w:p>
     <w:p>
       <w:pPr>
+        <w:spacing w:after="160" w:line="278" w:lineRule="auto"/>
+        <w:rPr>
+          <w:rFonts w:ascii="Cambria Math" w:hAnsi="Cambria Math"/>
+          <w:b/>
+          <w:bCs/>
+          <w:color w:val="273540"/>
+        </w:rPr>
+      </w:pPr>
+      <w:r>
+        <w:rPr>
+          <w:rFonts w:ascii="Cambria Math" w:hAnsi="Cambria Math"/>
+          <w:b/>
+          <w:bCs/>
+          <w:color w:val="273540"/>
+        </w:rPr>
+        <w:br w:type="page"/>
+      </w:r>
+    </w:p>
+    <w:p>
+      <w:pPr>
         <w:pStyle w:val="ListParagraph"/>
         <w:numPr>
           <w:ilvl w:val="3"/>
@@ -2728,6 +2789,7 @@
           <w:kern w:val="0"/>
           <w14:ligatures w14:val="none"/>
         </w:rPr>
+        <w:lastRenderedPageBreak/>
         <w:t>Explain the steps require to "translate" the research question into an equation or computation. In other words, explain how someone could use linear algebra to answer the question? Try to teach your peers how to answer similar questions using linear algebra.</w:t>
       </w:r>
     </w:p>
@@ -5290,7 +5352,6 @@
           <w:rFonts w:ascii="Cambria Math" w:hAnsi="Cambria Math"/>
           <w:color w:val="273540"/>
         </w:rPr>
-        <w:lastRenderedPageBreak/>
         <w:t>In the assessment-only grade weighting method, which only takes tests into account, the weight for the assessment score is 1, the weight for the homework score is 0, and the weight for the employability score is 0.</w:t>
       </w:r>
     </w:p>
@@ -5330,6 +5391,26 @@
           <w:color w:val="273540"/>
         </w:rPr>
         <w:br/>
+      </w:r>
+    </w:p>
+    <w:p>
+      <w:pPr>
+        <w:spacing w:after="160" w:line="278" w:lineRule="auto"/>
+        <w:rPr>
+          <w:rFonts w:ascii="Cambria Math" w:hAnsi="Cambria Math"/>
+          <w:b/>
+          <w:bCs/>
+          <w:color w:val="273540"/>
+        </w:rPr>
+      </w:pPr>
+      <w:r>
+        <w:rPr>
+          <w:rFonts w:ascii="Cambria Math" w:hAnsi="Cambria Math"/>
+          <w:b/>
+          <w:bCs/>
+          <w:color w:val="273540"/>
+        </w:rPr>
+        <w:br w:type="page"/>
       </w:r>
     </w:p>
     <w:p>
@@ -5363,6 +5444,7 @@
           <w:kern w:val="0"/>
           <w14:ligatures w14:val="none"/>
         </w:rPr>
+        <w:lastRenderedPageBreak/>
         <w:t>You don't need to show all the computations, especially if they are lengthy. Label where the linear algebra techniques you named were used in this computation.</w:t>
       </w:r>
     </w:p>
@@ -5742,6 +5824,26 @@
     </w:p>
     <w:p>
       <w:pPr>
+        <w:spacing w:after="160" w:line="278" w:lineRule="auto"/>
+        <w:rPr>
+          <w:rFonts w:ascii="Cambria Math" w:hAnsi="Cambria Math"/>
+          <w:b/>
+          <w:bCs/>
+          <w:color w:val="273540"/>
+        </w:rPr>
+      </w:pPr>
+      <w:r>
+        <w:rPr>
+          <w:rFonts w:ascii="Cambria Math" w:hAnsi="Cambria Math"/>
+          <w:b/>
+          <w:bCs/>
+          <w:color w:val="273540"/>
+        </w:rPr>
+        <w:br w:type="page"/>
+      </w:r>
+    </w:p>
+    <w:p>
+      <w:pPr>
         <w:pStyle w:val="ListParagraph"/>
         <w:numPr>
           <w:ilvl w:val="3"/>
@@ -5771,247 +5873,694 @@
           <w:kern w:val="0"/>
           <w14:ligatures w14:val="none"/>
         </w:rPr>
+        <w:lastRenderedPageBreak/>
         <w:t>Write (in words) a conclusion interpreting the result of the computation, including any relevant units. Make sure to answer the research question you began with.</w:t>
       </w:r>
     </w:p>
     <w:p>
       <w:pPr>
+        <w:ind w:left="1080"/>
+        <w:rPr>
+          <w:rFonts w:ascii="Cambria Math" w:hAnsi="Cambria Math"/>
+        </w:rPr>
+      </w:pPr>
+      <w:r>
+        <w:rPr>
+          <w:rFonts w:ascii="Cambria Math" w:hAnsi="Cambria Math"/>
+        </w:rPr>
+        <w:t>By computing final grades under multiple weighting methods and calculating the resulting equity gaps between different demographic groups, the method minimizes disparities can be determined. The method that produces the smallest equity gaps while maintaining academic standards is the most equitable method.</w:t>
+      </w:r>
+    </w:p>
+    <w:p>
+      <w:pPr>
+        <w:ind w:left="1080"/>
+        <w:rPr>
+          <w:rFonts w:ascii="Cambria Math" w:hAnsi="Cambria Math"/>
+        </w:rPr>
+      </w:pPr>
+    </w:p>
+    <w:p>
+      <w:pPr>
+        <w:ind w:left="1080"/>
+        <w:rPr>
+          <w:rFonts w:ascii="Cambria Math" w:hAnsi="Cambria Math"/>
+        </w:rPr>
+      </w:pPr>
+      <w:r>
+        <w:rPr>
+          <w:rFonts w:ascii="Cambria Math" w:hAnsi="Cambria Math"/>
+        </w:rPr>
+        <w:t xml:space="preserve">When </w:t>
+      </w:r>
+      <w:r>
+        <w:rPr>
+          <w:rFonts w:ascii="Cambria Math" w:hAnsi="Cambria Math"/>
+        </w:rPr>
+        <w:t xml:space="preserve">switching from </w:t>
+      </w:r>
+      <w:r>
+        <w:rPr>
+          <w:rFonts w:ascii="Cambria Math" w:hAnsi="Cambria Math"/>
+        </w:rPr>
+        <w:t xml:space="preserve">the </w:t>
+      </w:r>
+      <w:r>
+        <w:rPr>
+          <w:rFonts w:ascii="Cambria Math" w:hAnsi="Cambria Math"/>
+        </w:rPr>
+        <w:t xml:space="preserve">assessment-only </w:t>
+      </w:r>
+      <w:r>
+        <w:rPr>
+          <w:rFonts w:ascii="Cambria Math" w:hAnsi="Cambria Math"/>
+        </w:rPr>
+        <w:t xml:space="preserve">grade weighting method </w:t>
+      </w:r>
+      <w:r>
+        <w:rPr>
+          <w:rFonts w:ascii="Cambria Math" w:hAnsi="Cambria Math"/>
+        </w:rPr>
+        <w:t xml:space="preserve">to </w:t>
+      </w:r>
+      <w:r>
+        <w:rPr>
+          <w:rFonts w:ascii="Cambria Math" w:hAnsi="Cambria Math"/>
+        </w:rPr>
+        <w:t xml:space="preserve">the </w:t>
+      </w:r>
+      <w:r>
+        <w:rPr>
+          <w:rFonts w:ascii="Cambria Math" w:hAnsi="Cambria Math"/>
+        </w:rPr>
+        <w:t>traditional grad</w:t>
+      </w:r>
+      <w:r>
+        <w:rPr>
+          <w:rFonts w:ascii="Cambria Math" w:hAnsi="Cambria Math"/>
+        </w:rPr>
+        <w:t>e weighting method</w:t>
+      </w:r>
+      <w:r>
+        <w:rPr>
+          <w:rFonts w:ascii="Cambria Math" w:hAnsi="Cambria Math"/>
+        </w:rPr>
+        <w:t>, we found significant equity gaps across all demographic categories extended.</w:t>
+      </w:r>
+    </w:p>
+    <w:p>
+      <w:pPr>
+        <w:pStyle w:val="ListParagraph"/>
+        <w:numPr>
+          <w:ilvl w:val="2"/>
+          <w:numId w:val="11"/>
+        </w:numPr>
+        <w:ind w:left="1620" w:hanging="180"/>
+        <w:rPr>
+          <w:rFonts w:ascii="Cambria Math" w:hAnsi="Cambria Math"/>
+        </w:rPr>
+      </w:pPr>
+      <w:r>
+        <w:rPr>
+          <w:rFonts w:ascii="Cambria Math" w:hAnsi="Cambria Math"/>
+        </w:rPr>
+        <w:t>Students without disabilities gained an average of 5.2 points</w:t>
+      </w:r>
+      <w:r>
+        <w:rPr>
+          <w:rFonts w:ascii="Cambria Math" w:hAnsi="Cambria Math"/>
+        </w:rPr>
+        <w:t>, whereas s</w:t>
+      </w:r>
+      <w:r>
+        <w:rPr>
+          <w:rFonts w:ascii="Cambria Math" w:hAnsi="Cambria Math"/>
+        </w:rPr>
+        <w:t>tudents with disabilities gained an average of 2.8 points</w:t>
+      </w:r>
+      <w:r>
+        <w:rPr>
+          <w:rFonts w:ascii="Cambria Math" w:hAnsi="Cambria Math"/>
+        </w:rPr>
+        <w:t xml:space="preserve">. </w:t>
+      </w:r>
+      <w:r>
+        <w:rPr>
+          <w:rFonts w:ascii="Cambria Math" w:hAnsi="Cambria Math"/>
+        </w:rPr>
+        <w:t>This creates an equity gap of 2.4 points</w:t>
+      </w:r>
+      <w:r>
+        <w:rPr>
+          <w:rFonts w:ascii="Cambria Math" w:hAnsi="Cambria Math"/>
+        </w:rPr>
+        <w:t>.</w:t>
+      </w:r>
+    </w:p>
+    <w:p>
+      <w:pPr>
+        <w:pStyle w:val="ListParagraph"/>
+        <w:numPr>
+          <w:ilvl w:val="2"/>
+          <w:numId w:val="11"/>
+        </w:numPr>
+        <w:ind w:left="1620" w:hanging="180"/>
+        <w:rPr>
+          <w:rFonts w:ascii="Cambria Math" w:hAnsi="Cambria Math"/>
+        </w:rPr>
+      </w:pPr>
+      <w:r>
+        <w:rPr>
+          <w:rFonts w:ascii="Cambria Math" w:hAnsi="Cambria Math"/>
+        </w:rPr>
+        <w:t>White students gained an average of 5.8 points</w:t>
+      </w:r>
+      <w:r>
+        <w:rPr>
+          <w:rFonts w:ascii="Cambria Math" w:hAnsi="Cambria Math"/>
+        </w:rPr>
+        <w:t xml:space="preserve">, </w:t>
+      </w:r>
+      <w:r>
+        <w:rPr>
+          <w:rFonts w:ascii="Cambria Math" w:hAnsi="Cambria Math"/>
+        </w:rPr>
+        <w:t>Asian students gained an average of 5.3 points</w:t>
+      </w:r>
+      <w:r>
+        <w:rPr>
+          <w:rFonts w:ascii="Cambria Math" w:hAnsi="Cambria Math"/>
+        </w:rPr>
+        <w:t xml:space="preserve">, </w:t>
+      </w:r>
+      <w:r>
+        <w:rPr>
+          <w:rFonts w:ascii="Cambria Math" w:hAnsi="Cambria Math"/>
+        </w:rPr>
+        <w:t>Hispanic students gained an average of 4.1 points</w:t>
+      </w:r>
+      <w:r>
+        <w:rPr>
+          <w:rFonts w:ascii="Cambria Math" w:hAnsi="Cambria Math"/>
+        </w:rPr>
+        <w:t xml:space="preserve">, and </w:t>
+      </w:r>
+      <w:r>
+        <w:rPr>
+          <w:rFonts w:ascii="Cambria Math" w:hAnsi="Cambria Math"/>
+        </w:rPr>
+        <w:t>Black students gained an average of 3.2 points</w:t>
+      </w:r>
+      <w:r>
+        <w:rPr>
+          <w:rFonts w:ascii="Cambria Math" w:hAnsi="Cambria Math"/>
+        </w:rPr>
+        <w:t xml:space="preserve">. </w:t>
+      </w:r>
+      <w:r>
+        <w:rPr>
+          <w:rFonts w:ascii="Cambria Math" w:hAnsi="Cambria Math"/>
+        </w:rPr>
+        <w:t>This creates an equity gap of 2.6 points between White and Black students</w:t>
+      </w:r>
+      <w:r>
+        <w:rPr>
+          <w:rFonts w:ascii="Cambria Math" w:hAnsi="Cambria Math"/>
+        </w:rPr>
+        <w:t>.</w:t>
+      </w:r>
+    </w:p>
+    <w:p>
+      <w:pPr>
+        <w:pStyle w:val="ListParagraph"/>
+        <w:numPr>
+          <w:ilvl w:val="2"/>
+          <w:numId w:val="11"/>
+        </w:numPr>
+        <w:ind w:left="1620" w:hanging="180"/>
+        <w:rPr>
+          <w:rFonts w:ascii="Cambria Math" w:hAnsi="Cambria Math"/>
+        </w:rPr>
+      </w:pPr>
+      <w:r>
+        <w:rPr>
+          <w:rFonts w:ascii="Cambria Math" w:hAnsi="Cambria Math"/>
+        </w:rPr>
+        <w:t>Students not receiving FRL gained an average of 6.1 points</w:t>
+      </w:r>
+      <w:r>
+        <w:rPr>
+          <w:rFonts w:ascii="Cambria Math" w:hAnsi="Cambria Math"/>
+        </w:rPr>
+        <w:t>, whereas s</w:t>
+      </w:r>
+      <w:r>
+        <w:rPr>
+          <w:rFonts w:ascii="Cambria Math" w:hAnsi="Cambria Math"/>
+        </w:rPr>
+        <w:t>tudents receiving FRL gained an average of 3.7 points</w:t>
+      </w:r>
+      <w:r>
+        <w:rPr>
+          <w:rFonts w:ascii="Cambria Math" w:hAnsi="Cambria Math"/>
+        </w:rPr>
+        <w:t xml:space="preserve">. </w:t>
+      </w:r>
+      <w:r>
+        <w:rPr>
+          <w:rFonts w:ascii="Cambria Math" w:hAnsi="Cambria Math"/>
+        </w:rPr>
+        <w:t>This creates an equity gap of 2.4 points</w:t>
+      </w:r>
+      <w:r>
+        <w:rPr>
+          <w:rFonts w:ascii="Cambria Math" w:hAnsi="Cambria Math"/>
+        </w:rPr>
+        <w:t>.</w:t>
+      </w:r>
+    </w:p>
+    <w:p>
+      <w:pPr>
+        <w:pStyle w:val="ListParagraph"/>
+        <w:numPr>
+          <w:ilvl w:val="2"/>
+          <w:numId w:val="11"/>
+        </w:numPr>
+        <w:spacing w:after="0"/>
+        <w:ind w:left="1620" w:hanging="180"/>
+        <w:rPr>
+          <w:rFonts w:ascii="Cambria Math" w:hAnsi="Cambria Math"/>
+        </w:rPr>
+      </w:pPr>
+      <w:r>
+        <w:rPr>
+          <w:rFonts w:ascii="Cambria Math" w:hAnsi="Cambria Math"/>
+        </w:rPr>
+        <w:t>Female students gained an average of 5.4 points</w:t>
+      </w:r>
+      <w:r>
+        <w:rPr>
+          <w:rFonts w:ascii="Cambria Math" w:hAnsi="Cambria Math"/>
+        </w:rPr>
+        <w:t>, whereas m</w:t>
+      </w:r>
+      <w:r>
+        <w:rPr>
+          <w:rFonts w:ascii="Cambria Math" w:hAnsi="Cambria Math"/>
+        </w:rPr>
+        <w:t>ale students gained an average of 4.8 points</w:t>
+      </w:r>
+      <w:r>
+        <w:rPr>
+          <w:rFonts w:ascii="Cambria Math" w:hAnsi="Cambria Math"/>
+        </w:rPr>
+        <w:t xml:space="preserve">. </w:t>
+      </w:r>
+      <w:r>
+        <w:rPr>
+          <w:rFonts w:ascii="Cambria Math" w:hAnsi="Cambria Math"/>
+        </w:rPr>
+        <w:t>This creates an equity gap of 0.6 points (the smallest disparity)</w:t>
+      </w:r>
+      <w:r>
+        <w:rPr>
+          <w:rFonts w:ascii="Cambria Math" w:hAnsi="Cambria Math"/>
+        </w:rPr>
+        <w:t>.</w:t>
+      </w:r>
+    </w:p>
+    <w:p>
+      <w:pPr>
+        <w:ind w:left="1080"/>
+        <w:rPr>
+          <w:rFonts w:ascii="Cambria Math" w:hAnsi="Cambria Math"/>
+        </w:rPr>
+      </w:pPr>
+    </w:p>
+    <w:p>
+      <w:pPr>
+        <w:ind w:left="1080"/>
+        <w:rPr>
+          <w:rFonts w:ascii="Cambria Math" w:hAnsi="Cambria Math"/>
+        </w:rPr>
+      </w:pPr>
+      <w:r>
+        <w:rPr>
+          <w:rFonts w:ascii="Cambria Math" w:hAnsi="Cambria Math"/>
+        </w:rPr>
+        <w:t xml:space="preserve">Based on the analysis, the assessment-only grading method produces smaller </w:t>
+      </w:r>
+      <w:r>
+        <w:rPr>
+          <w:rFonts w:ascii="Cambria Math" w:hAnsi="Cambria Math"/>
+        </w:rPr>
+        <w:t>equity gaps across all demographic categories examined.</w:t>
+      </w:r>
+    </w:p>
+    <w:p>
+      <w:pPr>
         <w:shd w:val="clear" w:color="auto" w:fill="FFFFFF"/>
         <w:ind w:left="360" w:firstLine="720"/>
         <w:rPr>
           <w:rFonts w:ascii="Cambria Math" w:hAnsi="Cambria Math"/>
           <w:color w:val="EE0000"/>
-        </w:rPr>
-      </w:pPr>
-      <w:r>
-        <w:rPr>
-          <w:rFonts w:ascii="Cambria Math" w:hAnsi="Cambria Math"/>
-          <w:color w:val="EE0000"/>
           <w:highlight w:val="cyan"/>
         </w:rPr>
-        <w:t>NEED TO DO</w:t>
-      </w:r>
+      </w:pPr>
     </w:p>
     <w:p>
       <w:pPr>
-        <w:shd w:val="clear" w:color="auto" w:fill="FFFFFF"/>
-        <w:ind w:left="1080"/>
-        <w:rPr>
-          <w:rFonts w:ascii="Cambria Math" w:hAnsi="Cambria Math"/>
-          <w:color w:val="000000" w:themeColor="text1"/>
-          <w:highlight w:val="cyan"/>
-        </w:rPr>
-      </w:pPr>
-      <w:r>
-        <w:rPr>
-          <w:rFonts w:ascii="Cambria Math" w:hAnsi="Cambria Math"/>
-          <w:color w:val="000000" w:themeColor="text1"/>
-          <w:highlight w:val="cyan"/>
-        </w:rPr>
-        <w:t>Things to discuss:</w:t>
+        <w:spacing w:after="160" w:line="278" w:lineRule="auto"/>
+        <w:rPr>
+          <w:rFonts w:ascii="Cambria Math" w:hAnsi="Cambria Math"/>
+        </w:rPr>
+      </w:pPr>
+      <w:r>
+        <w:rPr>
+          <w:rFonts w:ascii="Cambria Math" w:hAnsi="Cambria Math"/>
+        </w:rPr>
+        <w:br w:type="page"/>
       </w:r>
     </w:p>
     <w:p>
       <w:pPr>
-        <w:pStyle w:val="ListParagraph"/>
+        <w:ind w:left="1080"/>
+        <w:rPr>
+          <w:rFonts w:ascii="Cambria Math" w:hAnsi="Cambria Math"/>
+        </w:rPr>
+      </w:pPr>
+      <w:r>
+        <w:rPr>
+          <w:rFonts w:ascii="Cambria Math" w:hAnsi="Cambria Math"/>
+        </w:rPr>
+        <w:lastRenderedPageBreak/>
+        <w:t>There are s</w:t>
+      </w:r>
+      <w:r>
+        <w:rPr>
+          <w:rFonts w:ascii="Cambria Math" w:hAnsi="Cambria Math"/>
+        </w:rPr>
+        <w:t>everal important limitations</w:t>
+      </w:r>
+      <w:r>
+        <w:rPr>
+          <w:rFonts w:ascii="Cambria Math" w:hAnsi="Cambria Math"/>
+        </w:rPr>
+        <w:t>, both based on demographics and the model scope</w:t>
+      </w:r>
+      <w:r>
+        <w:rPr>
+          <w:rFonts w:ascii="Cambria Math" w:hAnsi="Cambria Math"/>
+        </w:rPr>
+        <w:t>:</w:t>
+      </w:r>
+    </w:p>
+    <w:p>
+      <w:pPr>
+        <w:ind w:left="720" w:firstLine="720"/>
+        <w:rPr>
+          <w:rFonts w:ascii="Cambria Math" w:hAnsi="Cambria Math"/>
+        </w:rPr>
+      </w:pPr>
+      <w:r>
+        <w:rPr>
+          <w:rFonts w:ascii="Cambria Math" w:hAnsi="Cambria Math"/>
+          <w:u w:val="single"/>
+        </w:rPr>
+        <w:t>Demographic Category Limitations</w:t>
+      </w:r>
+      <w:r>
+        <w:rPr>
+          <w:rFonts w:ascii="Cambria Math" w:hAnsi="Cambria Math"/>
+        </w:rPr>
+        <w:t>:</w:t>
+      </w:r>
+    </w:p>
+    <w:p>
+      <w:pPr>
         <w:numPr>
           <w:ilvl w:val="0"/>
-          <w:numId w:val="3"/>
+          <w:numId w:val="5"/>
         </w:numPr>
-        <w:shd w:val="clear" w:color="auto" w:fill="FFFFFF"/>
-        <w:ind w:left="1800" w:hanging="180"/>
-        <w:rPr>
-          <w:rFonts w:ascii="Cambria Math" w:hAnsi="Cambria Math"/>
-          <w:color w:val="000000" w:themeColor="text1"/>
-          <w:highlight w:val="cyan"/>
-        </w:rPr>
-      </w:pPr>
-      <w:r>
-        <w:rPr>
-          <w:rFonts w:ascii="Cambria Math" w:hAnsi="Cambria Math"/>
-          <w:color w:val="000000" w:themeColor="text1"/>
-          <w:highlight w:val="cyan"/>
-        </w:rPr>
-        <w:t>determination of disability (u</w:t>
-      </w:r>
-      <w:r>
-        <w:rPr>
-          <w:rFonts w:ascii="Cambria Math" w:hAnsi="Cambria Math"/>
-          <w:color w:val="000000" w:themeColor="text1"/>
-          <w:highlight w:val="cyan"/>
-        </w:rPr>
-        <w:t>ndiagnosed disabilities</w:t>
-      </w:r>
-      <w:r>
-        <w:rPr>
-          <w:rFonts w:ascii="Cambria Math" w:hAnsi="Cambria Math"/>
-          <w:color w:val="000000" w:themeColor="text1"/>
-          <w:highlight w:val="cyan"/>
-        </w:rPr>
-        <w:t>)</w:t>
+        <w:tabs>
+          <w:tab w:val="clear" w:pos="720"/>
+        </w:tabs>
+        <w:ind w:left="1620" w:hanging="180"/>
+        <w:rPr>
+          <w:rFonts w:ascii="Cambria Math" w:hAnsi="Cambria Math"/>
+        </w:rPr>
+      </w:pPr>
+      <w:r>
+        <w:rPr>
+          <w:rFonts w:ascii="Cambria Math" w:hAnsi="Cambria Math"/>
+          <w:u w:val="single"/>
+        </w:rPr>
+        <w:t>Disability determination</w:t>
+      </w:r>
+      <w:r>
+        <w:rPr>
+          <w:rFonts w:ascii="Cambria Math" w:hAnsi="Cambria Math"/>
+        </w:rPr>
+        <w:t>: This model only counts students with formal IEP or 504 plans. Many students have undiagnosed disabilities (such as neurodivergence, ADHD, dyslexia, anxiety disorders) that affect their homework completion but aren't formally documented. This means this model likely underestimates the impact on students with disabilities.</w:t>
       </w:r>
     </w:p>
     <w:p>
       <w:pPr>
-        <w:pStyle w:val="ListParagraph"/>
         <w:numPr>
           <w:ilvl w:val="0"/>
-          <w:numId w:val="3"/>
+          <w:numId w:val="5"/>
         </w:numPr>
-        <w:shd w:val="clear" w:color="auto" w:fill="FFFFFF"/>
-        <w:ind w:left="1800" w:hanging="180"/>
-        <w:rPr>
-          <w:rFonts w:ascii="Cambria Math" w:hAnsi="Cambria Math"/>
-          <w:color w:val="000000" w:themeColor="text1"/>
-          <w:highlight w:val="cyan"/>
-        </w:rPr>
-      </w:pPr>
-      <w:r>
-        <w:rPr>
-          <w:rFonts w:ascii="Cambria Math" w:hAnsi="Cambria Math"/>
-          <w:color w:val="000000" w:themeColor="text1"/>
-          <w:highlight w:val="cyan"/>
-        </w:rPr>
-        <w:t>determination of race (</w:t>
-      </w:r>
-      <w:r>
-        <w:rPr>
-          <w:rFonts w:ascii="Cambria Math" w:hAnsi="Cambria Math"/>
-          <w:color w:val="000000" w:themeColor="text1"/>
-          <w:highlight w:val="cyan"/>
-        </w:rPr>
-        <w:t>biracial</w:t>
-      </w:r>
-      <w:r>
-        <w:rPr>
-          <w:rFonts w:ascii="Cambria Math" w:hAnsi="Cambria Math"/>
-          <w:color w:val="000000" w:themeColor="text1"/>
-          <w:highlight w:val="cyan"/>
-        </w:rPr>
-        <w:t xml:space="preserve">/multiracial students, </w:t>
-      </w:r>
-      <w:r>
-        <w:rPr>
-          <w:rFonts w:ascii="Cambria Math" w:hAnsi="Cambria Math"/>
-          <w:color w:val="000000" w:themeColor="text1"/>
-          <w:highlight w:val="cyan"/>
-        </w:rPr>
-        <w:t>and different subsets of populations like different Asian backgrounds)</w:t>
+        <w:tabs>
+          <w:tab w:val="clear" w:pos="720"/>
+        </w:tabs>
+        <w:ind w:left="1620" w:hanging="180"/>
+        <w:rPr>
+          <w:rFonts w:ascii="Cambria Math" w:hAnsi="Cambria Math"/>
+        </w:rPr>
+      </w:pPr>
+      <w:r>
+        <w:rPr>
+          <w:rFonts w:ascii="Cambria Math" w:hAnsi="Cambria Math"/>
+          <w:u w:val="single"/>
+        </w:rPr>
+        <w:t>Race determination</w:t>
+      </w:r>
+      <w:r>
+        <w:rPr>
+          <w:rFonts w:ascii="Cambria Math" w:hAnsi="Cambria Math"/>
+        </w:rPr>
+        <w:t xml:space="preserve">: The dataset uses single-race categories, which doesn't capture the experience of biracial or multiracial students. Additionally, different subsets of populations (like different Asian backgrounds, such as East Asian, Southeast Asian, South Asian) have vastly different educational </w:t>
+      </w:r>
+      <w:proofErr w:type="gramStart"/>
+      <w:r>
+        <w:rPr>
+          <w:rFonts w:ascii="Cambria Math" w:hAnsi="Cambria Math"/>
+        </w:rPr>
+        <w:t>experiences, but</w:t>
+      </w:r>
+      <w:proofErr w:type="gramEnd"/>
+      <w:r>
+        <w:rPr>
+          <w:rFonts w:ascii="Cambria Math" w:hAnsi="Cambria Math"/>
+        </w:rPr>
+        <w:t xml:space="preserve"> are grouped together as "Asian" in the data.</w:t>
       </w:r>
     </w:p>
     <w:p>
       <w:pPr>
-        <w:pStyle w:val="ListParagraph"/>
         <w:numPr>
           <w:ilvl w:val="0"/>
-          <w:numId w:val="3"/>
+          <w:numId w:val="5"/>
         </w:numPr>
-        <w:shd w:val="clear" w:color="auto" w:fill="FFFFFF"/>
-        <w:ind w:left="1800" w:hanging="180"/>
-        <w:rPr>
-          <w:rFonts w:ascii="Cambria Math" w:hAnsi="Cambria Math"/>
-          <w:color w:val="000000" w:themeColor="text1"/>
-          <w:highlight w:val="cyan"/>
-        </w:rPr>
-      </w:pPr>
-      <w:r>
-        <w:rPr>
-          <w:rFonts w:ascii="Cambria Math" w:hAnsi="Cambria Math"/>
-          <w:color w:val="000000" w:themeColor="text1"/>
-          <w:highlight w:val="cyan"/>
-        </w:rPr>
-        <w:t>determination of SES (based on FRL)</w:t>
+        <w:tabs>
+          <w:tab w:val="clear" w:pos="720"/>
+        </w:tabs>
+        <w:ind w:left="1620" w:hanging="180"/>
+        <w:rPr>
+          <w:rFonts w:ascii="Cambria Math" w:hAnsi="Cambria Math"/>
+        </w:rPr>
+      </w:pPr>
+      <w:r>
+        <w:rPr>
+          <w:rFonts w:ascii="Cambria Math" w:hAnsi="Cambria Math"/>
+          <w:u w:val="single"/>
+        </w:rPr>
+        <w:t>SES determination</w:t>
+      </w:r>
+      <w:r>
+        <w:rPr>
+          <w:rFonts w:ascii="Cambria Math" w:hAnsi="Cambria Math"/>
+        </w:rPr>
+        <w:t>: Based solely on whether students receive free or reduced lunch (FRL). This doesn't capture students just above the eligibility cutoff who still face financial hardship, or students experiencing temporary housing instability.</w:t>
       </w:r>
     </w:p>
     <w:p>
       <w:pPr>
-        <w:pStyle w:val="ListParagraph"/>
         <w:numPr>
           <w:ilvl w:val="0"/>
-          <w:numId w:val="3"/>
+          <w:numId w:val="5"/>
         </w:numPr>
-        <w:shd w:val="clear" w:color="auto" w:fill="FFFFFF"/>
-        <w:ind w:left="1800" w:hanging="180"/>
-        <w:rPr>
-          <w:rFonts w:ascii="Cambria Math" w:hAnsi="Cambria Math"/>
-          <w:color w:val="000000" w:themeColor="text1"/>
-          <w:highlight w:val="cyan"/>
-        </w:rPr>
-      </w:pPr>
-      <w:r>
-        <w:rPr>
-          <w:rFonts w:ascii="Cambria Math" w:hAnsi="Cambria Math"/>
-          <w:color w:val="000000" w:themeColor="text1"/>
-          <w:highlight w:val="cyan"/>
-        </w:rPr>
-        <w:t xml:space="preserve">determination of gender (difference between school’s </w:t>
-      </w:r>
-      <w:r>
-        <w:rPr>
-          <w:rFonts w:ascii="Cambria Math" w:hAnsi="Cambria Math"/>
-          <w:color w:val="000000" w:themeColor="text1"/>
-          <w:highlight w:val="cyan"/>
-        </w:rPr>
-        <w:t xml:space="preserve">gender identity for student </w:t>
-      </w:r>
-      <w:r>
-        <w:rPr>
-          <w:rFonts w:ascii="Cambria Math" w:hAnsi="Cambria Math"/>
-          <w:color w:val="000000" w:themeColor="text1"/>
-          <w:highlight w:val="cyan"/>
-        </w:rPr>
-        <w:t>versus</w:t>
-      </w:r>
-      <w:r>
-        <w:rPr>
-          <w:rFonts w:ascii="Cambria Math" w:hAnsi="Cambria Math"/>
-          <w:color w:val="000000" w:themeColor="text1"/>
-          <w:highlight w:val="cyan"/>
-        </w:rPr>
-        <w:t xml:space="preserve"> student’s </w:t>
-      </w:r>
-      <w:r>
-        <w:rPr>
-          <w:rFonts w:ascii="Cambria Math" w:hAnsi="Cambria Math"/>
-          <w:color w:val="000000" w:themeColor="text1"/>
-          <w:highlight w:val="cyan"/>
-        </w:rPr>
-        <w:t xml:space="preserve">own </w:t>
-      </w:r>
-      <w:r>
-        <w:rPr>
-          <w:rFonts w:ascii="Cambria Math" w:hAnsi="Cambria Math"/>
-          <w:color w:val="000000" w:themeColor="text1"/>
-          <w:highlight w:val="cyan"/>
-        </w:rPr>
-        <w:t>gender identity</w:t>
-      </w:r>
-      <w:r>
-        <w:rPr>
-          <w:rFonts w:ascii="Cambria Math" w:hAnsi="Cambria Math"/>
-          <w:color w:val="000000" w:themeColor="text1"/>
-          <w:highlight w:val="cyan"/>
-        </w:rPr>
-        <w:t>, including</w:t>
-      </w:r>
-      <w:r>
-        <w:rPr>
-          <w:rFonts w:ascii="Cambria Math" w:hAnsi="Cambria Math"/>
-          <w:color w:val="000000" w:themeColor="text1"/>
-          <w:highlight w:val="cyan"/>
-        </w:rPr>
-        <w:t xml:space="preserve"> nonbinary)</w:t>
+        <w:tabs>
+          <w:tab w:val="clear" w:pos="720"/>
+        </w:tabs>
+        <w:ind w:left="1620" w:hanging="180"/>
+        <w:rPr>
+          <w:rFonts w:ascii="Cambria Math" w:hAnsi="Cambria Math"/>
+        </w:rPr>
+      </w:pPr>
+      <w:r>
+        <w:rPr>
+          <w:rFonts w:ascii="Cambria Math" w:hAnsi="Cambria Math"/>
+          <w:u w:val="single"/>
+        </w:rPr>
+        <w:t>Gender determination</w:t>
+      </w:r>
+      <w:r>
+        <w:rPr>
+          <w:rFonts w:ascii="Cambria Math" w:hAnsi="Cambria Math"/>
+        </w:rPr>
+        <w:t>: The school's gender identity for a student may differ from the student's own gender identity. The binary categorization doesn't include nonbinary students or account for transgender students.</w:t>
       </w:r>
     </w:p>
     <w:p>
       <w:pPr>
-        <w:rPr>
-          <w:rFonts w:ascii="Cambria Math" w:hAnsi="Cambria Math"/>
-          <w:b/>
-          <w:bCs/>
-          <w:color w:val="273540"/>
-        </w:rPr>
-      </w:pPr>
+        <w:ind w:left="720"/>
+        <w:rPr>
+          <w:rFonts w:ascii="Cambria Math" w:hAnsi="Cambria Math"/>
+        </w:rPr>
+      </w:pPr>
+    </w:p>
+    <w:p>
+      <w:pPr>
+        <w:ind w:left="720" w:firstLine="720"/>
+        <w:rPr>
+          <w:rFonts w:ascii="Cambria Math" w:hAnsi="Cambria Math"/>
+        </w:rPr>
+      </w:pPr>
+      <w:r>
+        <w:rPr>
+          <w:rFonts w:ascii="Cambria Math" w:hAnsi="Cambria Math"/>
+          <w:u w:val="single"/>
+        </w:rPr>
+        <w:t>Model Scope Limitations</w:t>
+      </w:r>
+      <w:r>
+        <w:rPr>
+          <w:rFonts w:ascii="Cambria Math" w:hAnsi="Cambria Math"/>
+        </w:rPr>
+        <w:t>:</w:t>
+      </w:r>
+    </w:p>
+    <w:p>
+      <w:pPr>
+        <w:ind w:left="1440"/>
+        <w:rPr>
+          <w:rFonts w:ascii="Cambria Math" w:hAnsi="Cambria Math"/>
+        </w:rPr>
+      </w:pPr>
+      <w:r>
+        <w:rPr>
+          <w:rFonts w:ascii="Cambria Math" w:hAnsi="Cambria Math"/>
+        </w:rPr>
+        <w:t>This model measures one aspect of equity, which is differences in grade outcomes between demographic groups. However, it doesn't capture:</w:t>
+      </w:r>
+    </w:p>
+    <w:p>
+      <w:pPr>
+        <w:numPr>
+          <w:ilvl w:val="0"/>
+          <w:numId w:val="5"/>
+        </w:numPr>
+        <w:tabs>
+          <w:tab w:val="clear" w:pos="720"/>
+        </w:tabs>
+        <w:ind w:left="1620" w:hanging="180"/>
+        <w:rPr>
+          <w:rFonts w:ascii="Cambria Math" w:hAnsi="Cambria Math"/>
+        </w:rPr>
+      </w:pPr>
+      <w:r>
+        <w:rPr>
+          <w:rFonts w:ascii="Cambria Math" w:hAnsi="Cambria Math"/>
+        </w:rPr>
+        <w:t>Whether the assessments themselves are culturally biased</w:t>
+      </w:r>
+    </w:p>
+    <w:p>
+      <w:pPr>
+        <w:numPr>
+          <w:ilvl w:val="0"/>
+          <w:numId w:val="5"/>
+        </w:numPr>
+        <w:tabs>
+          <w:tab w:val="clear" w:pos="720"/>
+        </w:tabs>
+        <w:ind w:left="1620" w:hanging="180"/>
+        <w:rPr>
+          <w:rFonts w:ascii="Cambria Math" w:hAnsi="Cambria Math"/>
+        </w:rPr>
+      </w:pPr>
+      <w:r>
+        <w:rPr>
+          <w:rFonts w:ascii="Cambria Math" w:hAnsi="Cambria Math"/>
+        </w:rPr>
+        <w:t xml:space="preserve">Whether grades </w:t>
+      </w:r>
+      <w:proofErr w:type="gramStart"/>
+      <w:r>
+        <w:rPr>
+          <w:rFonts w:ascii="Cambria Math" w:hAnsi="Cambria Math"/>
+        </w:rPr>
+        <w:t>actually reflect</w:t>
+      </w:r>
+      <w:proofErr w:type="gramEnd"/>
+      <w:r>
+        <w:rPr>
+          <w:rFonts w:ascii="Cambria Math" w:hAnsi="Cambria Math"/>
+        </w:rPr>
+        <w:t xml:space="preserve"> learning</w:t>
+      </w:r>
+    </w:p>
+    <w:p>
+      <w:pPr>
+        <w:numPr>
+          <w:ilvl w:val="0"/>
+          <w:numId w:val="5"/>
+        </w:numPr>
+        <w:tabs>
+          <w:tab w:val="clear" w:pos="720"/>
+        </w:tabs>
+        <w:ind w:left="1620" w:hanging="180"/>
+        <w:rPr>
+          <w:rFonts w:ascii="Cambria Math" w:hAnsi="Cambria Math"/>
+        </w:rPr>
+      </w:pPr>
+      <w:r>
+        <w:rPr>
+          <w:rFonts w:ascii="Cambria Math" w:hAnsi="Cambria Math"/>
+        </w:rPr>
+        <w:t>Quality of instruction received by different groups</w:t>
+      </w:r>
+    </w:p>
+    <w:p>
+      <w:pPr>
+        <w:numPr>
+          <w:ilvl w:val="0"/>
+          <w:numId w:val="5"/>
+        </w:numPr>
+        <w:tabs>
+          <w:tab w:val="clear" w:pos="720"/>
+        </w:tabs>
+        <w:ind w:left="1620" w:hanging="180"/>
+        <w:rPr>
+          <w:rFonts w:ascii="Cambria Math" w:hAnsi="Cambria Math"/>
+        </w:rPr>
+      </w:pPr>
+      <w:r>
+        <w:rPr>
+          <w:rFonts w:ascii="Cambria Math" w:hAnsi="Cambria Math"/>
+        </w:rPr>
+        <w:t>Out-of-school factors affecting performance</w:t>
+      </w:r>
       <w:r>
         <w:rPr>
           <w:rFonts w:ascii="Cambria Math" w:hAnsi="Cambria Math"/>
@@ -6311,28 +6860,7 @@
           <w:rFonts w:ascii="Cambria Math" w:hAnsi="Cambria Math"/>
           <w:color w:val="000000" w:themeColor="text1"/>
         </w:rPr>
-        <w:t>is considered “</w:t>
-      </w:r>
-      <w:r>
-        <w:rPr>
-          <w:rFonts w:ascii="Cambria Math" w:hAnsi="Cambria Math"/>
-          <w:color w:val="000000" w:themeColor="text1"/>
-        </w:rPr>
-        <w:t xml:space="preserve">not </w:t>
-      </w:r>
-      <w:r>
-        <w:rPr>
-          <w:rFonts w:ascii="Cambria Math" w:hAnsi="Cambria Math"/>
-          <w:color w:val="000000" w:themeColor="text1"/>
-        </w:rPr>
-        <w:t>disabled” for the purpose of this project</w:t>
-      </w:r>
-      <w:r>
-        <w:rPr>
-          <w:rFonts w:ascii="Cambria Math" w:hAnsi="Cambria Math"/>
-          <w:color w:val="000000" w:themeColor="text1"/>
-        </w:rPr>
-        <w:t xml:space="preserve">).  See the results section for a discussion on undiagnosed </w:t>
+        <w:t xml:space="preserve">is considered “not disabled” for the purpose of this project).  See the results section for a discussion on undiagnosed </w:t>
       </w:r>
       <w:r>
         <w:rPr>
@@ -6356,35 +6884,7 @@
           <w:rFonts w:ascii="Cambria Math" w:hAnsi="Cambria Math"/>
           <w:color w:val="000000" w:themeColor="text1"/>
         </w:rPr>
-        <w:t>Figure 5</w:t>
-      </w:r>
-      <w:r>
-        <w:rPr>
-          <w:rFonts w:ascii="Cambria Math" w:hAnsi="Cambria Math"/>
-          <w:color w:val="000000" w:themeColor="text1"/>
-        </w:rPr>
-        <w:t>b</w:t>
-      </w:r>
-      <w:r>
-        <w:rPr>
-          <w:rFonts w:ascii="Cambria Math" w:hAnsi="Cambria Math"/>
-          <w:color w:val="000000" w:themeColor="text1"/>
-        </w:rPr>
-        <w:t xml:space="preserve"> shows a pivot table for </w:t>
-      </w:r>
-      <w:r>
-        <w:rPr>
-          <w:rFonts w:ascii="Cambria Math" w:hAnsi="Cambria Math"/>
-          <w:color w:val="000000" w:themeColor="text1"/>
-        </w:rPr>
-        <w:t>race</w:t>
-      </w:r>
-      <w:r>
-        <w:rPr>
-          <w:rFonts w:ascii="Cambria Math" w:hAnsi="Cambria Math"/>
-          <w:color w:val="000000" w:themeColor="text1"/>
-        </w:rPr>
-        <w:t xml:space="preserve">, where </w:t>
+        <w:t xml:space="preserve">Figure 5b shows a pivot table for race, where </w:t>
       </w:r>
       <w:r>
         <w:rPr>
@@ -6492,28 +6992,7 @@
           <w:rFonts w:ascii="Cambria Math" w:hAnsi="Cambria Math"/>
           <w:color w:val="000000" w:themeColor="text1"/>
         </w:rPr>
-        <w:t xml:space="preserve">a free or reduced lunch (and is considered to have a </w:t>
-      </w:r>
-      <w:r>
-        <w:rPr>
-          <w:rFonts w:ascii="Cambria Math" w:hAnsi="Cambria Math"/>
-          <w:color w:val="000000" w:themeColor="text1"/>
-        </w:rPr>
-        <w:t>higher</w:t>
-      </w:r>
-      <w:r>
-        <w:rPr>
-          <w:rFonts w:ascii="Cambria Math" w:hAnsi="Cambria Math"/>
-          <w:color w:val="000000" w:themeColor="text1"/>
-        </w:rPr>
-        <w:t xml:space="preserve"> socioeconomic status for the purpose of this project)</w:t>
-      </w:r>
-      <w:r>
-        <w:rPr>
-          <w:rFonts w:ascii="Cambria Math" w:hAnsi="Cambria Math"/>
-          <w:color w:val="000000" w:themeColor="text1"/>
-        </w:rPr>
-        <w:t>.</w:t>
+        <w:t>a free or reduced lunch (and is considered to have a higher socioeconomic status for the purpose of this project).</w:t>
       </w:r>
     </w:p>
     <w:p>
@@ -13697,8 +14176,23 @@
           <w:u w:val="single"/>
         </w:rPr>
         <w:lastRenderedPageBreak/>
-        <w:t>Figure 5: Pivot Table</w:t>
-      </w:r>
+        <w:t>Figure 5: Pivot Tables by Demographic</w:t>
+      </w:r>
+    </w:p>
+    <w:p>
+      <w:pPr>
+        <w:rPr>
+          <w:rFonts w:ascii="Cambria Math" w:hAnsi="Cambria Math"/>
+        </w:rPr>
+      </w:pPr>
+    </w:p>
+    <w:p>
+      <w:pPr>
+        <w:ind w:firstLine="720"/>
+        <w:rPr>
+          <w:rFonts w:ascii="Cambria Math" w:hAnsi="Cambria Math"/>
+        </w:rPr>
+      </w:pPr>
       <w:r>
         <w:rPr>
           <w:rFonts w:ascii="Cambria Math" w:hAnsi="Cambria Math"/>
@@ -13707,42 +14201,7 @@
           <w:color w:val="273540"/>
           <w:u w:val="single"/>
         </w:rPr>
-        <w:t>s by Demographic</w:t>
-      </w:r>
-    </w:p>
-    <w:p>
-      <w:pPr>
-        <w:rPr>
-          <w:rFonts w:ascii="Cambria Math" w:hAnsi="Cambria Math"/>
-        </w:rPr>
-      </w:pPr>
-    </w:p>
-    <w:p>
-      <w:pPr>
-        <w:ind w:firstLine="720"/>
-        <w:rPr>
-          <w:rFonts w:ascii="Cambria Math" w:hAnsi="Cambria Math"/>
-        </w:rPr>
-      </w:pPr>
-      <w:r>
-        <w:rPr>
-          <w:rFonts w:ascii="Cambria Math" w:hAnsi="Cambria Math"/>
-          <w:b/>
-          <w:bCs/>
-          <w:color w:val="273540"/>
-          <w:u w:val="single"/>
-        </w:rPr>
-        <w:t xml:space="preserve">Figure </w:t>
-      </w:r>
-      <w:r>
-        <w:rPr>
-          <w:rFonts w:ascii="Cambria Math" w:hAnsi="Cambria Math"/>
-          <w:b/>
-          <w:bCs/>
-          <w:color w:val="273540"/>
-          <w:u w:val="single"/>
-        </w:rPr>
-        <w:t>5</w:t>
+        <w:t>Figure 5</w:t>
       </w:r>
       <w:r>
         <w:rPr>
@@ -13862,37 +14321,7 @@
           <w:color w:val="273540"/>
           <w:u w:val="single"/>
         </w:rPr>
-        <w:t>Figure 5</w:t>
-      </w:r>
-      <w:r>
-        <w:rPr>
-          <w:rFonts w:ascii="Cambria Math" w:hAnsi="Cambria Math"/>
-          <w:b/>
-          <w:bCs/>
-          <w:color w:val="273540"/>
-          <w:u w:val="single"/>
-        </w:rPr>
-        <w:t>b</w:t>
-      </w:r>
-      <w:r>
-        <w:rPr>
-          <w:rFonts w:ascii="Cambria Math" w:hAnsi="Cambria Math"/>
-          <w:b/>
-          <w:bCs/>
-          <w:color w:val="273540"/>
-          <w:u w:val="single"/>
-        </w:rPr>
-        <w:t xml:space="preserve">: Pivot Table for </w:t>
-      </w:r>
-      <w:r>
-        <w:rPr>
-          <w:rFonts w:ascii="Cambria Math" w:hAnsi="Cambria Math"/>
-          <w:b/>
-          <w:bCs/>
-          <w:color w:val="273540"/>
-          <w:u w:val="single"/>
-        </w:rPr>
-        <w:t>Race</w:t>
+        <w:t>Figure 5b: Pivot Table for Race</w:t>
       </w:r>
     </w:p>
     <w:p>
@@ -13986,57 +14415,7 @@
           <w:color w:val="273540"/>
           <w:u w:val="single"/>
         </w:rPr>
-        <w:t>Figure 5</w:t>
-      </w:r>
-      <w:r>
-        <w:rPr>
-          <w:rFonts w:ascii="Cambria Math" w:hAnsi="Cambria Math"/>
-          <w:b/>
-          <w:bCs/>
-          <w:color w:val="273540"/>
-          <w:u w:val="single"/>
-        </w:rPr>
-        <w:t>c</w:t>
-      </w:r>
-      <w:r>
-        <w:rPr>
-          <w:rFonts w:ascii="Cambria Math" w:hAnsi="Cambria Math"/>
-          <w:b/>
-          <w:bCs/>
-          <w:color w:val="273540"/>
-          <w:u w:val="single"/>
-        </w:rPr>
-        <w:t xml:space="preserve">: Pivot Table for </w:t>
-      </w:r>
-      <w:r>
-        <w:rPr>
-          <w:rFonts w:ascii="Cambria Math" w:hAnsi="Cambria Math"/>
-          <w:b/>
-          <w:bCs/>
-          <w:color w:val="273540"/>
-          <w:u w:val="single"/>
-        </w:rPr>
-        <w:t>FRL (S</w:t>
-      </w:r>
-      <w:r>
-        <w:rPr>
-          <w:rFonts w:ascii="Cambria Math" w:hAnsi="Cambria Math"/>
-          <w:b/>
-          <w:bCs/>
-          <w:color w:val="273540"/>
-          <w:u w:val="single"/>
-        </w:rPr>
-        <w:t>ocioeconomic Status</w:t>
-      </w:r>
-      <w:r>
-        <w:rPr>
-          <w:rFonts w:ascii="Cambria Math" w:hAnsi="Cambria Math"/>
-          <w:b/>
-          <w:bCs/>
-          <w:color w:val="273540"/>
-          <w:u w:val="single"/>
-        </w:rPr>
-        <w:t>)</w:t>
+        <w:t>Figure 5c: Pivot Table for FRL (Socioeconomic Status)</w:t>
       </w:r>
     </w:p>
     <w:p>
@@ -14129,37 +14508,7 @@
           <w:color w:val="273540"/>
           <w:u w:val="single"/>
         </w:rPr>
-        <w:t>Figure 5</w:t>
-      </w:r>
-      <w:r>
-        <w:rPr>
-          <w:rFonts w:ascii="Cambria Math" w:hAnsi="Cambria Math"/>
-          <w:b/>
-          <w:bCs/>
-          <w:color w:val="273540"/>
-          <w:u w:val="single"/>
-        </w:rPr>
-        <w:t>d</w:t>
-      </w:r>
-      <w:r>
-        <w:rPr>
-          <w:rFonts w:ascii="Cambria Math" w:hAnsi="Cambria Math"/>
-          <w:b/>
-          <w:bCs/>
-          <w:color w:val="273540"/>
-          <w:u w:val="single"/>
-        </w:rPr>
-        <w:t xml:space="preserve">: Pivot Table for </w:t>
-      </w:r>
-      <w:r>
-        <w:rPr>
-          <w:rFonts w:ascii="Cambria Math" w:hAnsi="Cambria Math"/>
-          <w:b/>
-          <w:bCs/>
-          <w:color w:val="273540"/>
-          <w:u w:val="single"/>
-        </w:rPr>
-        <w:t>Gender</w:t>
+        <w:t>Figure 5d: Pivot Table for Gender</w:t>
       </w:r>
     </w:p>
     <w:p>
@@ -14269,6 +14618,119 @@
 <file path=word/numbering.xml><?xml version="1.0" encoding="utf-8"?>
 <w:numbering xmlns:wpc="http://schemas.microsoft.com/office/word/2010/wordprocessingCanvas" xmlns:cx="http://schemas.microsoft.com/office/drawing/2014/chartex" xmlns:cx1="http://schemas.microsoft.com/office/drawing/2015/9/8/chartex" xmlns:cx2="http://schemas.microsoft.com/office/drawing/2015/10/21/chartex" xmlns:cx3="http://schemas.microsoft.com/office/drawing/2016/5/9/chartex" xmlns:cx4="http://schemas.microsoft.com/office/drawing/2016/5/10/chartex" xmlns:cx5="http://schemas.microsoft.com/office/drawing/2016/5/11/chartex" xmlns:cx6="http://schemas.microsoft.com/office/drawing/2016/5/12/chartex" xmlns:cx7="http://schemas.microsoft.com/office/drawing/2016/5/13/chartex" xmlns:cx8="http://schemas.microsoft.com/office/drawing/2016/5/14/chartex" xmlns:mc="http://schemas.openxmlformats.org/markup-compatibility/2006" xmlns:aink="http://schemas.microsoft.com/office/drawing/2016/ink" xmlns:am3d="http://schemas.microsoft.com/office/drawing/2017/model3d" xmlns:o="urn:schemas-microsoft-com:office:office" xmlns:oel="http://schemas.microsoft.com/office/2019/extlst" xmlns:r="http://schemas.openxmlformats.org/officeDocument/2006/relationships" xmlns:m="http://schemas.openxmlformats.org/officeDocument/2006/math" xmlns:v="urn:schemas-microsoft-com:vml" xmlns:wp14="http://schemas.microsoft.com/office/word/2010/wordprocessingDrawing" xmlns:wp="http://schemas.openxmlformats.org/drawingml/2006/wordprocessingDrawing" xmlns:w10="urn:schemas-microsoft-com:office:word" xmlns:w="http://schemas.openxmlformats.org/wordprocessingml/2006/main" xmlns:w14="http://schemas.microsoft.com/office/word/2010/wordml" xmlns:w15="http://schemas.microsoft.com/office/word/2012/wordml" xmlns:w16cex="http://schemas.microsoft.com/office/word/2018/wordml/cex" xmlns:w16cid="http://schemas.microsoft.com/office/word/2016/wordml/cid" xmlns:w16="http://schemas.microsoft.com/office/word/2018/wordml" xmlns:w16du="http://schemas.microsoft.com/office/word/2023/wordml/word16du" xmlns:w16sdtdh="http://schemas.microsoft.com/office/word/2020/wordml/sdtdatahash" xmlns:w16sdtfl="http://schemas.microsoft.com/office/word/2024/wordml/sdtformatlock" xmlns:w16se="http://schemas.microsoft.com/office/word/2015/wordml/symex" xmlns:wpg="http://schemas.microsoft.com/office/word/2010/wordprocessingGroup" xmlns:wpi="http://schemas.microsoft.com/office/word/2010/wordprocessingInk" xmlns:wne="http://schemas.microsoft.com/office/word/2006/wordml" xmlns:wps="http://schemas.microsoft.com/office/word/2010/wordprocessingShape" mc:Ignorable="w14 w15 w16se w16cid w16 w16cex w16sdtdh w16sdtfl w16du wp14">
   <w:abstractNum w:abstractNumId="0" w15:restartNumberingAfterBreak="0">
+    <w:nsid w:val="0B683F00"/>
+    <w:multiLevelType w:val="hybridMultilevel"/>
+    <w:tmpl w:val="62E44878"/>
+    <w:lvl w:ilvl="0" w:tplc="04090001">
+      <w:start w:val="1"/>
+      <w:numFmt w:val="bullet"/>
+      <w:lvlText w:val=""/>
+      <w:lvlJc w:val="left"/>
+      <w:pPr>
+        <w:ind w:left="720" w:hanging="360"/>
+      </w:pPr>
+      <w:rPr>
+        <w:rFonts w:ascii="Symbol" w:hAnsi="Symbol" w:hint="default"/>
+      </w:rPr>
+    </w:lvl>
+    <w:lvl w:ilvl="1" w:tplc="04090003" w:tentative="1">
+      <w:start w:val="1"/>
+      <w:numFmt w:val="bullet"/>
+      <w:lvlText w:val="o"/>
+      <w:lvlJc w:val="left"/>
+      <w:pPr>
+        <w:ind w:left="1440" w:hanging="360"/>
+      </w:pPr>
+      <w:rPr>
+        <w:rFonts w:ascii="Courier New" w:hAnsi="Courier New" w:cs="Courier New" w:hint="default"/>
+      </w:rPr>
+    </w:lvl>
+    <w:lvl w:ilvl="2" w:tplc="04090005">
+      <w:start w:val="1"/>
+      <w:numFmt w:val="bullet"/>
+      <w:lvlText w:val=""/>
+      <w:lvlJc w:val="left"/>
+      <w:pPr>
+        <w:ind w:left="2160" w:hanging="360"/>
+      </w:pPr>
+      <w:rPr>
+        <w:rFonts w:ascii="Wingdings" w:hAnsi="Wingdings" w:hint="default"/>
+      </w:rPr>
+    </w:lvl>
+    <w:lvl w:ilvl="3" w:tplc="04090001" w:tentative="1">
+      <w:start w:val="1"/>
+      <w:numFmt w:val="bullet"/>
+      <w:lvlText w:val=""/>
+      <w:lvlJc w:val="left"/>
+      <w:pPr>
+        <w:ind w:left="2880" w:hanging="360"/>
+      </w:pPr>
+      <w:rPr>
+        <w:rFonts w:ascii="Symbol" w:hAnsi="Symbol" w:hint="default"/>
+      </w:rPr>
+    </w:lvl>
+    <w:lvl w:ilvl="4" w:tplc="04090003" w:tentative="1">
+      <w:start w:val="1"/>
+      <w:numFmt w:val="bullet"/>
+      <w:lvlText w:val="o"/>
+      <w:lvlJc w:val="left"/>
+      <w:pPr>
+        <w:ind w:left="3600" w:hanging="360"/>
+      </w:pPr>
+      <w:rPr>
+        <w:rFonts w:ascii="Courier New" w:hAnsi="Courier New" w:cs="Courier New" w:hint="default"/>
+      </w:rPr>
+    </w:lvl>
+    <w:lvl w:ilvl="5" w:tplc="04090005" w:tentative="1">
+      <w:start w:val="1"/>
+      <w:numFmt w:val="bullet"/>
+      <w:lvlText w:val=""/>
+      <w:lvlJc w:val="left"/>
+      <w:pPr>
+        <w:ind w:left="4320" w:hanging="360"/>
+      </w:pPr>
+      <w:rPr>
+        <w:rFonts w:ascii="Wingdings" w:hAnsi="Wingdings" w:hint="default"/>
+      </w:rPr>
+    </w:lvl>
+    <w:lvl w:ilvl="6" w:tplc="04090001" w:tentative="1">
+      <w:start w:val="1"/>
+      <w:numFmt w:val="bullet"/>
+      <w:lvlText w:val=""/>
+      <w:lvlJc w:val="left"/>
+      <w:pPr>
+        <w:ind w:left="5040" w:hanging="360"/>
+      </w:pPr>
+      <w:rPr>
+        <w:rFonts w:ascii="Symbol" w:hAnsi="Symbol" w:hint="default"/>
+      </w:rPr>
+    </w:lvl>
+    <w:lvl w:ilvl="7" w:tplc="04090003" w:tentative="1">
+      <w:start w:val="1"/>
+      <w:numFmt w:val="bullet"/>
+      <w:lvlText w:val="o"/>
+      <w:lvlJc w:val="left"/>
+      <w:pPr>
+        <w:ind w:left="5760" w:hanging="360"/>
+      </w:pPr>
+      <w:rPr>
+        <w:rFonts w:ascii="Courier New" w:hAnsi="Courier New" w:cs="Courier New" w:hint="default"/>
+      </w:rPr>
+    </w:lvl>
+    <w:lvl w:ilvl="8" w:tplc="04090005" w:tentative="1">
+      <w:start w:val="1"/>
+      <w:numFmt w:val="bullet"/>
+      <w:lvlText w:val=""/>
+      <w:lvlJc w:val="left"/>
+      <w:pPr>
+        <w:ind w:left="6480" w:hanging="360"/>
+      </w:pPr>
+      <w:rPr>
+        <w:rFonts w:ascii="Wingdings" w:hAnsi="Wingdings" w:hint="default"/>
+      </w:rPr>
+    </w:lvl>
+  </w:abstractNum>
+  <w:abstractNum w:abstractNumId="1" w15:restartNumberingAfterBreak="0">
     <w:nsid w:val="1B831F5B"/>
     <w:multiLevelType w:val="multilevel"/>
     <w:tmpl w:val="86B446FA"/>
@@ -14385,17 +14847,17 @@
       </w:pPr>
     </w:lvl>
   </w:abstractNum>
-  <w:abstractNum w:abstractNumId="1" w15:restartNumberingAfterBreak="0">
-    <w:nsid w:val="54FB715F"/>
+  <w:abstractNum w:abstractNumId="2" w15:restartNumberingAfterBreak="0">
+    <w:nsid w:val="1F512ECE"/>
     <w:multiLevelType w:val="hybridMultilevel"/>
-    <w:tmpl w:val="403CAB10"/>
+    <w:tmpl w:val="98F2087A"/>
     <w:lvl w:ilvl="0" w:tplc="04090001">
       <w:start w:val="1"/>
       <w:numFmt w:val="bullet"/>
       <w:lvlText w:val=""/>
       <w:lvlJc w:val="left"/>
       <w:pPr>
-        <w:ind w:left="2160" w:hanging="360"/>
+        <w:ind w:left="720" w:hanging="360"/>
       </w:pPr>
       <w:rPr>
         <w:rFonts w:ascii="Symbol" w:hAnsi="Symbol" w:hint="default"/>
@@ -14407,6 +14869,607 @@
       <w:lvlText w:val="o"/>
       <w:lvlJc w:val="left"/>
       <w:pPr>
+        <w:ind w:left="1440" w:hanging="360"/>
+      </w:pPr>
+      <w:rPr>
+        <w:rFonts w:ascii="Courier New" w:hAnsi="Courier New" w:cs="Courier New" w:hint="default"/>
+      </w:rPr>
+    </w:lvl>
+    <w:lvl w:ilvl="2" w:tplc="04090005">
+      <w:start w:val="1"/>
+      <w:numFmt w:val="bullet"/>
+      <w:lvlText w:val=""/>
+      <w:lvlJc w:val="left"/>
+      <w:pPr>
+        <w:ind w:left="2160" w:hanging="360"/>
+      </w:pPr>
+      <w:rPr>
+        <w:rFonts w:ascii="Wingdings" w:hAnsi="Wingdings" w:hint="default"/>
+      </w:rPr>
+    </w:lvl>
+    <w:lvl w:ilvl="3" w:tplc="04090001" w:tentative="1">
+      <w:start w:val="1"/>
+      <w:numFmt w:val="bullet"/>
+      <w:lvlText w:val=""/>
+      <w:lvlJc w:val="left"/>
+      <w:pPr>
+        <w:ind w:left="2880" w:hanging="360"/>
+      </w:pPr>
+      <w:rPr>
+        <w:rFonts w:ascii="Symbol" w:hAnsi="Symbol" w:hint="default"/>
+      </w:rPr>
+    </w:lvl>
+    <w:lvl w:ilvl="4" w:tplc="04090003" w:tentative="1">
+      <w:start w:val="1"/>
+      <w:numFmt w:val="bullet"/>
+      <w:lvlText w:val="o"/>
+      <w:lvlJc w:val="left"/>
+      <w:pPr>
+        <w:ind w:left="3600" w:hanging="360"/>
+      </w:pPr>
+      <w:rPr>
+        <w:rFonts w:ascii="Courier New" w:hAnsi="Courier New" w:cs="Courier New" w:hint="default"/>
+      </w:rPr>
+    </w:lvl>
+    <w:lvl w:ilvl="5" w:tplc="04090005" w:tentative="1">
+      <w:start w:val="1"/>
+      <w:numFmt w:val="bullet"/>
+      <w:lvlText w:val=""/>
+      <w:lvlJc w:val="left"/>
+      <w:pPr>
+        <w:ind w:left="4320" w:hanging="360"/>
+      </w:pPr>
+      <w:rPr>
+        <w:rFonts w:ascii="Wingdings" w:hAnsi="Wingdings" w:hint="default"/>
+      </w:rPr>
+    </w:lvl>
+    <w:lvl w:ilvl="6" w:tplc="04090001" w:tentative="1">
+      <w:start w:val="1"/>
+      <w:numFmt w:val="bullet"/>
+      <w:lvlText w:val=""/>
+      <w:lvlJc w:val="left"/>
+      <w:pPr>
+        <w:ind w:left="5040" w:hanging="360"/>
+      </w:pPr>
+      <w:rPr>
+        <w:rFonts w:ascii="Symbol" w:hAnsi="Symbol" w:hint="default"/>
+      </w:rPr>
+    </w:lvl>
+    <w:lvl w:ilvl="7" w:tplc="04090003" w:tentative="1">
+      <w:start w:val="1"/>
+      <w:numFmt w:val="bullet"/>
+      <w:lvlText w:val="o"/>
+      <w:lvlJc w:val="left"/>
+      <w:pPr>
+        <w:ind w:left="5760" w:hanging="360"/>
+      </w:pPr>
+      <w:rPr>
+        <w:rFonts w:ascii="Courier New" w:hAnsi="Courier New" w:cs="Courier New" w:hint="default"/>
+      </w:rPr>
+    </w:lvl>
+    <w:lvl w:ilvl="8" w:tplc="04090005" w:tentative="1">
+      <w:start w:val="1"/>
+      <w:numFmt w:val="bullet"/>
+      <w:lvlText w:val=""/>
+      <w:lvlJc w:val="left"/>
+      <w:pPr>
+        <w:ind w:left="6480" w:hanging="360"/>
+      </w:pPr>
+      <w:rPr>
+        <w:rFonts w:ascii="Wingdings" w:hAnsi="Wingdings" w:hint="default"/>
+      </w:rPr>
+    </w:lvl>
+  </w:abstractNum>
+  <w:abstractNum w:abstractNumId="3" w15:restartNumberingAfterBreak="0">
+    <w:nsid w:val="23CA341F"/>
+    <w:multiLevelType w:val="hybridMultilevel"/>
+    <w:tmpl w:val="6D4ED224"/>
+    <w:lvl w:ilvl="0" w:tplc="04090001">
+      <w:start w:val="1"/>
+      <w:numFmt w:val="bullet"/>
+      <w:lvlText w:val=""/>
+      <w:lvlJc w:val="left"/>
+      <w:pPr>
+        <w:ind w:left="720" w:hanging="360"/>
+      </w:pPr>
+      <w:rPr>
+        <w:rFonts w:ascii="Symbol" w:hAnsi="Symbol" w:hint="default"/>
+      </w:rPr>
+    </w:lvl>
+    <w:lvl w:ilvl="1" w:tplc="04090003" w:tentative="1">
+      <w:start w:val="1"/>
+      <w:numFmt w:val="bullet"/>
+      <w:lvlText w:val="o"/>
+      <w:lvlJc w:val="left"/>
+      <w:pPr>
+        <w:ind w:left="1440" w:hanging="360"/>
+      </w:pPr>
+      <w:rPr>
+        <w:rFonts w:ascii="Courier New" w:hAnsi="Courier New" w:cs="Courier New" w:hint="default"/>
+      </w:rPr>
+    </w:lvl>
+    <w:lvl w:ilvl="2" w:tplc="04090005">
+      <w:start w:val="1"/>
+      <w:numFmt w:val="bullet"/>
+      <w:lvlText w:val=""/>
+      <w:lvlJc w:val="left"/>
+      <w:pPr>
+        <w:ind w:left="2160" w:hanging="360"/>
+      </w:pPr>
+      <w:rPr>
+        <w:rFonts w:ascii="Wingdings" w:hAnsi="Wingdings" w:hint="default"/>
+      </w:rPr>
+    </w:lvl>
+    <w:lvl w:ilvl="3" w:tplc="04090001" w:tentative="1">
+      <w:start w:val="1"/>
+      <w:numFmt w:val="bullet"/>
+      <w:lvlText w:val=""/>
+      <w:lvlJc w:val="left"/>
+      <w:pPr>
+        <w:ind w:left="2880" w:hanging="360"/>
+      </w:pPr>
+      <w:rPr>
+        <w:rFonts w:ascii="Symbol" w:hAnsi="Symbol" w:hint="default"/>
+      </w:rPr>
+    </w:lvl>
+    <w:lvl w:ilvl="4" w:tplc="04090003" w:tentative="1">
+      <w:start w:val="1"/>
+      <w:numFmt w:val="bullet"/>
+      <w:lvlText w:val="o"/>
+      <w:lvlJc w:val="left"/>
+      <w:pPr>
+        <w:ind w:left="3600" w:hanging="360"/>
+      </w:pPr>
+      <w:rPr>
+        <w:rFonts w:ascii="Courier New" w:hAnsi="Courier New" w:cs="Courier New" w:hint="default"/>
+      </w:rPr>
+    </w:lvl>
+    <w:lvl w:ilvl="5" w:tplc="04090005" w:tentative="1">
+      <w:start w:val="1"/>
+      <w:numFmt w:val="bullet"/>
+      <w:lvlText w:val=""/>
+      <w:lvlJc w:val="left"/>
+      <w:pPr>
+        <w:ind w:left="4320" w:hanging="360"/>
+      </w:pPr>
+      <w:rPr>
+        <w:rFonts w:ascii="Wingdings" w:hAnsi="Wingdings" w:hint="default"/>
+      </w:rPr>
+    </w:lvl>
+    <w:lvl w:ilvl="6" w:tplc="04090001" w:tentative="1">
+      <w:start w:val="1"/>
+      <w:numFmt w:val="bullet"/>
+      <w:lvlText w:val=""/>
+      <w:lvlJc w:val="left"/>
+      <w:pPr>
+        <w:ind w:left="5040" w:hanging="360"/>
+      </w:pPr>
+      <w:rPr>
+        <w:rFonts w:ascii="Symbol" w:hAnsi="Symbol" w:hint="default"/>
+      </w:rPr>
+    </w:lvl>
+    <w:lvl w:ilvl="7" w:tplc="04090003" w:tentative="1">
+      <w:start w:val="1"/>
+      <w:numFmt w:val="bullet"/>
+      <w:lvlText w:val="o"/>
+      <w:lvlJc w:val="left"/>
+      <w:pPr>
+        <w:ind w:left="5760" w:hanging="360"/>
+      </w:pPr>
+      <w:rPr>
+        <w:rFonts w:ascii="Courier New" w:hAnsi="Courier New" w:cs="Courier New" w:hint="default"/>
+      </w:rPr>
+    </w:lvl>
+    <w:lvl w:ilvl="8" w:tplc="04090005" w:tentative="1">
+      <w:start w:val="1"/>
+      <w:numFmt w:val="bullet"/>
+      <w:lvlText w:val=""/>
+      <w:lvlJc w:val="left"/>
+      <w:pPr>
+        <w:ind w:left="6480" w:hanging="360"/>
+      </w:pPr>
+      <w:rPr>
+        <w:rFonts w:ascii="Wingdings" w:hAnsi="Wingdings" w:hint="default"/>
+      </w:rPr>
+    </w:lvl>
+  </w:abstractNum>
+  <w:abstractNum w:abstractNumId="4" w15:restartNumberingAfterBreak="0">
+    <w:nsid w:val="2D195ADB"/>
+    <w:multiLevelType w:val="multilevel"/>
+    <w:tmpl w:val="83E69B12"/>
+    <w:lvl w:ilvl="0">
+      <w:start w:val="1"/>
+      <w:numFmt w:val="bullet"/>
+      <w:lvlText w:val=""/>
+      <w:lvlJc w:val="left"/>
+      <w:pPr>
+        <w:tabs>
+          <w:tab w:val="num" w:pos="720"/>
+        </w:tabs>
+        <w:ind w:left="720" w:hanging="360"/>
+      </w:pPr>
+      <w:rPr>
+        <w:rFonts w:ascii="Symbol" w:hAnsi="Symbol" w:hint="default"/>
+        <w:sz w:val="20"/>
+      </w:rPr>
+    </w:lvl>
+    <w:lvl w:ilvl="1" w:tentative="1">
+      <w:start w:val="1"/>
+      <w:numFmt w:val="bullet"/>
+      <w:lvlText w:val="o"/>
+      <w:lvlJc w:val="left"/>
+      <w:pPr>
+        <w:tabs>
+          <w:tab w:val="num" w:pos="1440"/>
+        </w:tabs>
+        <w:ind w:left="1440" w:hanging="360"/>
+      </w:pPr>
+      <w:rPr>
+        <w:rFonts w:ascii="Courier New" w:hAnsi="Courier New" w:hint="default"/>
+        <w:sz w:val="20"/>
+      </w:rPr>
+    </w:lvl>
+    <w:lvl w:ilvl="2" w:tentative="1">
+      <w:start w:val="1"/>
+      <w:numFmt w:val="bullet"/>
+      <w:lvlText w:val=""/>
+      <w:lvlJc w:val="left"/>
+      <w:pPr>
+        <w:tabs>
+          <w:tab w:val="num" w:pos="2160"/>
+        </w:tabs>
+        <w:ind w:left="2160" w:hanging="360"/>
+      </w:pPr>
+      <w:rPr>
+        <w:rFonts w:ascii="Wingdings" w:hAnsi="Wingdings" w:hint="default"/>
+        <w:sz w:val="20"/>
+      </w:rPr>
+    </w:lvl>
+    <w:lvl w:ilvl="3" w:tentative="1">
+      <w:start w:val="1"/>
+      <w:numFmt w:val="bullet"/>
+      <w:lvlText w:val=""/>
+      <w:lvlJc w:val="left"/>
+      <w:pPr>
+        <w:tabs>
+          <w:tab w:val="num" w:pos="2880"/>
+        </w:tabs>
+        <w:ind w:left="2880" w:hanging="360"/>
+      </w:pPr>
+      <w:rPr>
+        <w:rFonts w:ascii="Wingdings" w:hAnsi="Wingdings" w:hint="default"/>
+        <w:sz w:val="20"/>
+      </w:rPr>
+    </w:lvl>
+    <w:lvl w:ilvl="4" w:tentative="1">
+      <w:start w:val="1"/>
+      <w:numFmt w:val="bullet"/>
+      <w:lvlText w:val=""/>
+      <w:lvlJc w:val="left"/>
+      <w:pPr>
+        <w:tabs>
+          <w:tab w:val="num" w:pos="3600"/>
+        </w:tabs>
+        <w:ind w:left="3600" w:hanging="360"/>
+      </w:pPr>
+      <w:rPr>
+        <w:rFonts w:ascii="Wingdings" w:hAnsi="Wingdings" w:hint="default"/>
+        <w:sz w:val="20"/>
+      </w:rPr>
+    </w:lvl>
+    <w:lvl w:ilvl="5" w:tentative="1">
+      <w:start w:val="1"/>
+      <w:numFmt w:val="bullet"/>
+      <w:lvlText w:val=""/>
+      <w:lvlJc w:val="left"/>
+      <w:pPr>
+        <w:tabs>
+          <w:tab w:val="num" w:pos="4320"/>
+        </w:tabs>
+        <w:ind w:left="4320" w:hanging="360"/>
+      </w:pPr>
+      <w:rPr>
+        <w:rFonts w:ascii="Wingdings" w:hAnsi="Wingdings" w:hint="default"/>
+        <w:sz w:val="20"/>
+      </w:rPr>
+    </w:lvl>
+    <w:lvl w:ilvl="6" w:tentative="1">
+      <w:start w:val="1"/>
+      <w:numFmt w:val="bullet"/>
+      <w:lvlText w:val=""/>
+      <w:lvlJc w:val="left"/>
+      <w:pPr>
+        <w:tabs>
+          <w:tab w:val="num" w:pos="5040"/>
+        </w:tabs>
+        <w:ind w:left="5040" w:hanging="360"/>
+      </w:pPr>
+      <w:rPr>
+        <w:rFonts w:ascii="Wingdings" w:hAnsi="Wingdings" w:hint="default"/>
+        <w:sz w:val="20"/>
+      </w:rPr>
+    </w:lvl>
+    <w:lvl w:ilvl="7" w:tentative="1">
+      <w:start w:val="1"/>
+      <w:numFmt w:val="bullet"/>
+      <w:lvlText w:val=""/>
+      <w:lvlJc w:val="left"/>
+      <w:pPr>
+        <w:tabs>
+          <w:tab w:val="num" w:pos="5760"/>
+        </w:tabs>
+        <w:ind w:left="5760" w:hanging="360"/>
+      </w:pPr>
+      <w:rPr>
+        <w:rFonts w:ascii="Wingdings" w:hAnsi="Wingdings" w:hint="default"/>
+        <w:sz w:val="20"/>
+      </w:rPr>
+    </w:lvl>
+    <w:lvl w:ilvl="8" w:tentative="1">
+      <w:start w:val="1"/>
+      <w:numFmt w:val="bullet"/>
+      <w:lvlText w:val=""/>
+      <w:lvlJc w:val="left"/>
+      <w:pPr>
+        <w:tabs>
+          <w:tab w:val="num" w:pos="6480"/>
+        </w:tabs>
+        <w:ind w:left="6480" w:hanging="360"/>
+      </w:pPr>
+      <w:rPr>
+        <w:rFonts w:ascii="Wingdings" w:hAnsi="Wingdings" w:hint="default"/>
+        <w:sz w:val="20"/>
+      </w:rPr>
+    </w:lvl>
+  </w:abstractNum>
+  <w:abstractNum w:abstractNumId="5" w15:restartNumberingAfterBreak="0">
+    <w:nsid w:val="399A1A40"/>
+    <w:multiLevelType w:val="hybridMultilevel"/>
+    <w:tmpl w:val="A2A2AC60"/>
+    <w:lvl w:ilvl="0" w:tplc="04090001">
+      <w:start w:val="1"/>
+      <w:numFmt w:val="bullet"/>
+      <w:lvlText w:val=""/>
+      <w:lvlJc w:val="left"/>
+      <w:pPr>
+        <w:ind w:left="720" w:hanging="360"/>
+      </w:pPr>
+      <w:rPr>
+        <w:rFonts w:ascii="Symbol" w:hAnsi="Symbol" w:hint="default"/>
+      </w:rPr>
+    </w:lvl>
+    <w:lvl w:ilvl="1" w:tplc="04090003" w:tentative="1">
+      <w:start w:val="1"/>
+      <w:numFmt w:val="bullet"/>
+      <w:lvlText w:val="o"/>
+      <w:lvlJc w:val="left"/>
+      <w:pPr>
+        <w:ind w:left="1440" w:hanging="360"/>
+      </w:pPr>
+      <w:rPr>
+        <w:rFonts w:ascii="Courier New" w:hAnsi="Courier New" w:cs="Courier New" w:hint="default"/>
+      </w:rPr>
+    </w:lvl>
+    <w:lvl w:ilvl="2" w:tplc="04090005">
+      <w:start w:val="1"/>
+      <w:numFmt w:val="bullet"/>
+      <w:lvlText w:val=""/>
+      <w:lvlJc w:val="left"/>
+      <w:pPr>
+        <w:ind w:left="2160" w:hanging="360"/>
+      </w:pPr>
+      <w:rPr>
+        <w:rFonts w:ascii="Wingdings" w:hAnsi="Wingdings" w:hint="default"/>
+      </w:rPr>
+    </w:lvl>
+    <w:lvl w:ilvl="3" w:tplc="04090001" w:tentative="1">
+      <w:start w:val="1"/>
+      <w:numFmt w:val="bullet"/>
+      <w:lvlText w:val=""/>
+      <w:lvlJc w:val="left"/>
+      <w:pPr>
+        <w:ind w:left="2880" w:hanging="360"/>
+      </w:pPr>
+      <w:rPr>
+        <w:rFonts w:ascii="Symbol" w:hAnsi="Symbol" w:hint="default"/>
+      </w:rPr>
+    </w:lvl>
+    <w:lvl w:ilvl="4" w:tplc="04090003" w:tentative="1">
+      <w:start w:val="1"/>
+      <w:numFmt w:val="bullet"/>
+      <w:lvlText w:val="o"/>
+      <w:lvlJc w:val="left"/>
+      <w:pPr>
+        <w:ind w:left="3600" w:hanging="360"/>
+      </w:pPr>
+      <w:rPr>
+        <w:rFonts w:ascii="Courier New" w:hAnsi="Courier New" w:cs="Courier New" w:hint="default"/>
+      </w:rPr>
+    </w:lvl>
+    <w:lvl w:ilvl="5" w:tplc="04090005" w:tentative="1">
+      <w:start w:val="1"/>
+      <w:numFmt w:val="bullet"/>
+      <w:lvlText w:val=""/>
+      <w:lvlJc w:val="left"/>
+      <w:pPr>
+        <w:ind w:left="4320" w:hanging="360"/>
+      </w:pPr>
+      <w:rPr>
+        <w:rFonts w:ascii="Wingdings" w:hAnsi="Wingdings" w:hint="default"/>
+      </w:rPr>
+    </w:lvl>
+    <w:lvl w:ilvl="6" w:tplc="04090001" w:tentative="1">
+      <w:start w:val="1"/>
+      <w:numFmt w:val="bullet"/>
+      <w:lvlText w:val=""/>
+      <w:lvlJc w:val="left"/>
+      <w:pPr>
+        <w:ind w:left="5040" w:hanging="360"/>
+      </w:pPr>
+      <w:rPr>
+        <w:rFonts w:ascii="Symbol" w:hAnsi="Symbol" w:hint="default"/>
+      </w:rPr>
+    </w:lvl>
+    <w:lvl w:ilvl="7" w:tplc="04090003" w:tentative="1">
+      <w:start w:val="1"/>
+      <w:numFmt w:val="bullet"/>
+      <w:lvlText w:val="o"/>
+      <w:lvlJc w:val="left"/>
+      <w:pPr>
+        <w:ind w:left="5760" w:hanging="360"/>
+      </w:pPr>
+      <w:rPr>
+        <w:rFonts w:ascii="Courier New" w:hAnsi="Courier New" w:cs="Courier New" w:hint="default"/>
+      </w:rPr>
+    </w:lvl>
+    <w:lvl w:ilvl="8" w:tplc="04090005" w:tentative="1">
+      <w:start w:val="1"/>
+      <w:numFmt w:val="bullet"/>
+      <w:lvlText w:val=""/>
+      <w:lvlJc w:val="left"/>
+      <w:pPr>
+        <w:ind w:left="6480" w:hanging="360"/>
+      </w:pPr>
+      <w:rPr>
+        <w:rFonts w:ascii="Wingdings" w:hAnsi="Wingdings" w:hint="default"/>
+      </w:rPr>
+    </w:lvl>
+  </w:abstractNum>
+  <w:abstractNum w:abstractNumId="6" w15:restartNumberingAfterBreak="0">
+    <w:nsid w:val="40567216"/>
+    <w:multiLevelType w:val="hybridMultilevel"/>
+    <w:tmpl w:val="1164A37A"/>
+    <w:lvl w:ilvl="0" w:tplc="04090001">
+      <w:start w:val="1"/>
+      <w:numFmt w:val="bullet"/>
+      <w:lvlText w:val=""/>
+      <w:lvlJc w:val="left"/>
+      <w:pPr>
+        <w:ind w:left="720" w:hanging="360"/>
+      </w:pPr>
+      <w:rPr>
+        <w:rFonts w:ascii="Symbol" w:hAnsi="Symbol" w:hint="default"/>
+      </w:rPr>
+    </w:lvl>
+    <w:lvl w:ilvl="1" w:tplc="04090003" w:tentative="1">
+      <w:start w:val="1"/>
+      <w:numFmt w:val="bullet"/>
+      <w:lvlText w:val="o"/>
+      <w:lvlJc w:val="left"/>
+      <w:pPr>
+        <w:ind w:left="1440" w:hanging="360"/>
+      </w:pPr>
+      <w:rPr>
+        <w:rFonts w:ascii="Courier New" w:hAnsi="Courier New" w:cs="Courier New" w:hint="default"/>
+      </w:rPr>
+    </w:lvl>
+    <w:lvl w:ilvl="2" w:tplc="04090005">
+      <w:start w:val="1"/>
+      <w:numFmt w:val="bullet"/>
+      <w:lvlText w:val=""/>
+      <w:lvlJc w:val="left"/>
+      <w:pPr>
+        <w:ind w:left="2160" w:hanging="360"/>
+      </w:pPr>
+      <w:rPr>
+        <w:rFonts w:ascii="Wingdings" w:hAnsi="Wingdings" w:hint="default"/>
+      </w:rPr>
+    </w:lvl>
+    <w:lvl w:ilvl="3" w:tplc="04090001" w:tentative="1">
+      <w:start w:val="1"/>
+      <w:numFmt w:val="bullet"/>
+      <w:lvlText w:val=""/>
+      <w:lvlJc w:val="left"/>
+      <w:pPr>
+        <w:ind w:left="2880" w:hanging="360"/>
+      </w:pPr>
+      <w:rPr>
+        <w:rFonts w:ascii="Symbol" w:hAnsi="Symbol" w:hint="default"/>
+      </w:rPr>
+    </w:lvl>
+    <w:lvl w:ilvl="4" w:tplc="04090003" w:tentative="1">
+      <w:start w:val="1"/>
+      <w:numFmt w:val="bullet"/>
+      <w:lvlText w:val="o"/>
+      <w:lvlJc w:val="left"/>
+      <w:pPr>
+        <w:ind w:left="3600" w:hanging="360"/>
+      </w:pPr>
+      <w:rPr>
+        <w:rFonts w:ascii="Courier New" w:hAnsi="Courier New" w:cs="Courier New" w:hint="default"/>
+      </w:rPr>
+    </w:lvl>
+    <w:lvl w:ilvl="5" w:tplc="04090005" w:tentative="1">
+      <w:start w:val="1"/>
+      <w:numFmt w:val="bullet"/>
+      <w:lvlText w:val=""/>
+      <w:lvlJc w:val="left"/>
+      <w:pPr>
+        <w:ind w:left="4320" w:hanging="360"/>
+      </w:pPr>
+      <w:rPr>
+        <w:rFonts w:ascii="Wingdings" w:hAnsi="Wingdings" w:hint="default"/>
+      </w:rPr>
+    </w:lvl>
+    <w:lvl w:ilvl="6" w:tplc="04090001" w:tentative="1">
+      <w:start w:val="1"/>
+      <w:numFmt w:val="bullet"/>
+      <w:lvlText w:val=""/>
+      <w:lvlJc w:val="left"/>
+      <w:pPr>
+        <w:ind w:left="5040" w:hanging="360"/>
+      </w:pPr>
+      <w:rPr>
+        <w:rFonts w:ascii="Symbol" w:hAnsi="Symbol" w:hint="default"/>
+      </w:rPr>
+    </w:lvl>
+    <w:lvl w:ilvl="7" w:tplc="04090003" w:tentative="1">
+      <w:start w:val="1"/>
+      <w:numFmt w:val="bullet"/>
+      <w:lvlText w:val="o"/>
+      <w:lvlJc w:val="left"/>
+      <w:pPr>
+        <w:ind w:left="5760" w:hanging="360"/>
+      </w:pPr>
+      <w:rPr>
+        <w:rFonts w:ascii="Courier New" w:hAnsi="Courier New" w:cs="Courier New" w:hint="default"/>
+      </w:rPr>
+    </w:lvl>
+    <w:lvl w:ilvl="8" w:tplc="04090005" w:tentative="1">
+      <w:start w:val="1"/>
+      <w:numFmt w:val="bullet"/>
+      <w:lvlText w:val=""/>
+      <w:lvlJc w:val="left"/>
+      <w:pPr>
+        <w:ind w:left="6480" w:hanging="360"/>
+      </w:pPr>
+      <w:rPr>
+        <w:rFonts w:ascii="Wingdings" w:hAnsi="Wingdings" w:hint="default"/>
+      </w:rPr>
+    </w:lvl>
+  </w:abstractNum>
+  <w:abstractNum w:abstractNumId="7" w15:restartNumberingAfterBreak="0">
+    <w:nsid w:val="54FB715F"/>
+    <w:multiLevelType w:val="hybridMultilevel"/>
+    <w:tmpl w:val="403CAB10"/>
+    <w:lvl w:ilvl="0" w:tplc="04090001">
+      <w:start w:val="1"/>
+      <w:numFmt w:val="bullet"/>
+      <w:lvlText w:val=""/>
+      <w:lvlJc w:val="left"/>
+      <w:pPr>
+        <w:ind w:left="2160" w:hanging="360"/>
+      </w:pPr>
+      <w:rPr>
+        <w:rFonts w:ascii="Symbol" w:hAnsi="Symbol" w:hint="default"/>
+      </w:rPr>
+    </w:lvl>
+    <w:lvl w:ilvl="1" w:tplc="04090003" w:tentative="1">
+      <w:start w:val="1"/>
+      <w:numFmt w:val="bullet"/>
+      <w:lvlText w:val="o"/>
+      <w:lvlJc w:val="left"/>
+      <w:pPr>
         <w:ind w:left="2880" w:hanging="360"/>
       </w:pPr>
       <w:rPr>
@@ -14498,7 +15561,156 @@
       </w:rPr>
     </w:lvl>
   </w:abstractNum>
-  <w:abstractNum w:abstractNumId="2" w15:restartNumberingAfterBreak="0">
+  <w:abstractNum w:abstractNumId="8" w15:restartNumberingAfterBreak="0">
+    <w:nsid w:val="570C24C6"/>
+    <w:multiLevelType w:val="multilevel"/>
+    <w:tmpl w:val="DDDE1AC4"/>
+    <w:lvl w:ilvl="0">
+      <w:start w:val="1"/>
+      <w:numFmt w:val="bullet"/>
+      <w:lvlText w:val=""/>
+      <w:lvlJc w:val="left"/>
+      <w:pPr>
+        <w:tabs>
+          <w:tab w:val="num" w:pos="720"/>
+        </w:tabs>
+        <w:ind w:left="720" w:hanging="360"/>
+      </w:pPr>
+      <w:rPr>
+        <w:rFonts w:ascii="Symbol" w:hAnsi="Symbol" w:hint="default"/>
+        <w:sz w:val="20"/>
+      </w:rPr>
+    </w:lvl>
+    <w:lvl w:ilvl="1" w:tentative="1">
+      <w:start w:val="1"/>
+      <w:numFmt w:val="bullet"/>
+      <w:lvlText w:val="o"/>
+      <w:lvlJc w:val="left"/>
+      <w:pPr>
+        <w:tabs>
+          <w:tab w:val="num" w:pos="1440"/>
+        </w:tabs>
+        <w:ind w:left="1440" w:hanging="360"/>
+      </w:pPr>
+      <w:rPr>
+        <w:rFonts w:ascii="Courier New" w:hAnsi="Courier New" w:hint="default"/>
+        <w:sz w:val="20"/>
+      </w:rPr>
+    </w:lvl>
+    <w:lvl w:ilvl="2" w:tentative="1">
+      <w:start w:val="1"/>
+      <w:numFmt w:val="bullet"/>
+      <w:lvlText w:val=""/>
+      <w:lvlJc w:val="left"/>
+      <w:pPr>
+        <w:tabs>
+          <w:tab w:val="num" w:pos="2160"/>
+        </w:tabs>
+        <w:ind w:left="2160" w:hanging="360"/>
+      </w:pPr>
+      <w:rPr>
+        <w:rFonts w:ascii="Wingdings" w:hAnsi="Wingdings" w:hint="default"/>
+        <w:sz w:val="20"/>
+      </w:rPr>
+    </w:lvl>
+    <w:lvl w:ilvl="3" w:tentative="1">
+      <w:start w:val="1"/>
+      <w:numFmt w:val="bullet"/>
+      <w:lvlText w:val=""/>
+      <w:lvlJc w:val="left"/>
+      <w:pPr>
+        <w:tabs>
+          <w:tab w:val="num" w:pos="2880"/>
+        </w:tabs>
+        <w:ind w:left="2880" w:hanging="360"/>
+      </w:pPr>
+      <w:rPr>
+        <w:rFonts w:ascii="Wingdings" w:hAnsi="Wingdings" w:hint="default"/>
+        <w:sz w:val="20"/>
+      </w:rPr>
+    </w:lvl>
+    <w:lvl w:ilvl="4" w:tentative="1">
+      <w:start w:val="1"/>
+      <w:numFmt w:val="bullet"/>
+      <w:lvlText w:val=""/>
+      <w:lvlJc w:val="left"/>
+      <w:pPr>
+        <w:tabs>
+          <w:tab w:val="num" w:pos="3600"/>
+        </w:tabs>
+        <w:ind w:left="3600" w:hanging="360"/>
+      </w:pPr>
+      <w:rPr>
+        <w:rFonts w:ascii="Wingdings" w:hAnsi="Wingdings" w:hint="default"/>
+        <w:sz w:val="20"/>
+      </w:rPr>
+    </w:lvl>
+    <w:lvl w:ilvl="5" w:tentative="1">
+      <w:start w:val="1"/>
+      <w:numFmt w:val="bullet"/>
+      <w:lvlText w:val=""/>
+      <w:lvlJc w:val="left"/>
+      <w:pPr>
+        <w:tabs>
+          <w:tab w:val="num" w:pos="4320"/>
+        </w:tabs>
+        <w:ind w:left="4320" w:hanging="360"/>
+      </w:pPr>
+      <w:rPr>
+        <w:rFonts w:ascii="Wingdings" w:hAnsi="Wingdings" w:hint="default"/>
+        <w:sz w:val="20"/>
+      </w:rPr>
+    </w:lvl>
+    <w:lvl w:ilvl="6" w:tentative="1">
+      <w:start w:val="1"/>
+      <w:numFmt w:val="bullet"/>
+      <w:lvlText w:val=""/>
+      <w:lvlJc w:val="left"/>
+      <w:pPr>
+        <w:tabs>
+          <w:tab w:val="num" w:pos="5040"/>
+        </w:tabs>
+        <w:ind w:left="5040" w:hanging="360"/>
+      </w:pPr>
+      <w:rPr>
+        <w:rFonts w:ascii="Wingdings" w:hAnsi="Wingdings" w:hint="default"/>
+        <w:sz w:val="20"/>
+      </w:rPr>
+    </w:lvl>
+    <w:lvl w:ilvl="7" w:tentative="1">
+      <w:start w:val="1"/>
+      <w:numFmt w:val="bullet"/>
+      <w:lvlText w:val=""/>
+      <w:lvlJc w:val="left"/>
+      <w:pPr>
+        <w:tabs>
+          <w:tab w:val="num" w:pos="5760"/>
+        </w:tabs>
+        <w:ind w:left="5760" w:hanging="360"/>
+      </w:pPr>
+      <w:rPr>
+        <w:rFonts w:ascii="Wingdings" w:hAnsi="Wingdings" w:hint="default"/>
+        <w:sz w:val="20"/>
+      </w:rPr>
+    </w:lvl>
+    <w:lvl w:ilvl="8" w:tentative="1">
+      <w:start w:val="1"/>
+      <w:numFmt w:val="bullet"/>
+      <w:lvlText w:val=""/>
+      <w:lvlJc w:val="left"/>
+      <w:pPr>
+        <w:tabs>
+          <w:tab w:val="num" w:pos="6480"/>
+        </w:tabs>
+        <w:ind w:left="6480" w:hanging="360"/>
+      </w:pPr>
+      <w:rPr>
+        <w:rFonts w:ascii="Wingdings" w:hAnsi="Wingdings" w:hint="default"/>
+        <w:sz w:val="20"/>
+      </w:rPr>
+    </w:lvl>
+  </w:abstractNum>
+  <w:abstractNum w:abstractNumId="9" w15:restartNumberingAfterBreak="0">
     <w:nsid w:val="68D34065"/>
     <w:multiLevelType w:val="multilevel"/>
     <w:tmpl w:val="66FEB016"/>
@@ -14611,14 +15823,124 @@
       </w:pPr>
     </w:lvl>
   </w:abstractNum>
+  <w:abstractNum w:abstractNumId="10" w15:restartNumberingAfterBreak="0">
+    <w:nsid w:val="781C123A"/>
+    <w:multiLevelType w:val="hybridMultilevel"/>
+    <w:tmpl w:val="D1564686"/>
+    <w:lvl w:ilvl="0" w:tplc="0409000F">
+      <w:start w:val="1"/>
+      <w:numFmt w:val="decimal"/>
+      <w:lvlText w:val="%1."/>
+      <w:lvlJc w:val="left"/>
+      <w:pPr>
+        <w:ind w:left="720" w:hanging="360"/>
+      </w:pPr>
+    </w:lvl>
+    <w:lvl w:ilvl="1" w:tplc="04090019" w:tentative="1">
+      <w:start w:val="1"/>
+      <w:numFmt w:val="lowerLetter"/>
+      <w:lvlText w:val="%2."/>
+      <w:lvlJc w:val="left"/>
+      <w:pPr>
+        <w:ind w:left="1440" w:hanging="360"/>
+      </w:pPr>
+    </w:lvl>
+    <w:lvl w:ilvl="2" w:tplc="0409001B">
+      <w:start w:val="1"/>
+      <w:numFmt w:val="lowerRoman"/>
+      <w:lvlText w:val="%3."/>
+      <w:lvlJc w:val="right"/>
+      <w:pPr>
+        <w:ind w:left="2160" w:hanging="180"/>
+      </w:pPr>
+    </w:lvl>
+    <w:lvl w:ilvl="3" w:tplc="0409000F" w:tentative="1">
+      <w:start w:val="1"/>
+      <w:numFmt w:val="decimal"/>
+      <w:lvlText w:val="%4."/>
+      <w:lvlJc w:val="left"/>
+      <w:pPr>
+        <w:ind w:left="2880" w:hanging="360"/>
+      </w:pPr>
+    </w:lvl>
+    <w:lvl w:ilvl="4" w:tplc="04090019" w:tentative="1">
+      <w:start w:val="1"/>
+      <w:numFmt w:val="lowerLetter"/>
+      <w:lvlText w:val="%5."/>
+      <w:lvlJc w:val="left"/>
+      <w:pPr>
+        <w:ind w:left="3600" w:hanging="360"/>
+      </w:pPr>
+    </w:lvl>
+    <w:lvl w:ilvl="5" w:tplc="0409001B" w:tentative="1">
+      <w:start w:val="1"/>
+      <w:numFmt w:val="lowerRoman"/>
+      <w:lvlText w:val="%6."/>
+      <w:lvlJc w:val="right"/>
+      <w:pPr>
+        <w:ind w:left="4320" w:hanging="180"/>
+      </w:pPr>
+    </w:lvl>
+    <w:lvl w:ilvl="6" w:tplc="0409000F" w:tentative="1">
+      <w:start w:val="1"/>
+      <w:numFmt w:val="decimal"/>
+      <w:lvlText w:val="%7."/>
+      <w:lvlJc w:val="left"/>
+      <w:pPr>
+        <w:ind w:left="5040" w:hanging="360"/>
+      </w:pPr>
+    </w:lvl>
+    <w:lvl w:ilvl="7" w:tplc="04090019" w:tentative="1">
+      <w:start w:val="1"/>
+      <w:numFmt w:val="lowerLetter"/>
+      <w:lvlText w:val="%8."/>
+      <w:lvlJc w:val="left"/>
+      <w:pPr>
+        <w:ind w:left="5760" w:hanging="360"/>
+      </w:pPr>
+    </w:lvl>
+    <w:lvl w:ilvl="8" w:tplc="0409001B" w:tentative="1">
+      <w:start w:val="1"/>
+      <w:numFmt w:val="lowerRoman"/>
+      <w:lvlText w:val="%9."/>
+      <w:lvlJc w:val="right"/>
+      <w:pPr>
+        <w:ind w:left="6480" w:hanging="180"/>
+      </w:pPr>
+    </w:lvl>
+  </w:abstractNum>
   <w:num w:numId="1" w16cid:durableId="1703281931">
+    <w:abstractNumId w:val="1"/>
+  </w:num>
+  <w:num w:numId="2" w16cid:durableId="1763526706">
+    <w:abstractNumId w:val="9"/>
+  </w:num>
+  <w:num w:numId="3" w16cid:durableId="268126374">
+    <w:abstractNumId w:val="7"/>
+  </w:num>
+  <w:num w:numId="4" w16cid:durableId="638072335">
+    <w:abstractNumId w:val="8"/>
+  </w:num>
+  <w:num w:numId="5" w16cid:durableId="1087268986">
+    <w:abstractNumId w:val="4"/>
+  </w:num>
+  <w:num w:numId="6" w16cid:durableId="1598829729">
+    <w:abstractNumId w:val="6"/>
+  </w:num>
+  <w:num w:numId="7" w16cid:durableId="1166439385">
+    <w:abstractNumId w:val="3"/>
+  </w:num>
+  <w:num w:numId="8" w16cid:durableId="1244873563">
+    <w:abstractNumId w:val="5"/>
+  </w:num>
+  <w:num w:numId="9" w16cid:durableId="1055658948">
     <w:abstractNumId w:val="0"/>
   </w:num>
-  <w:num w:numId="2" w16cid:durableId="1763526706">
+  <w:num w:numId="10" w16cid:durableId="1769698124">
+    <w:abstractNumId w:val="10"/>
+  </w:num>
+  <w:num w:numId="11" w16cid:durableId="775712719">
     <w:abstractNumId w:val="2"/>
-  </w:num>
-  <w:num w:numId="3" w16cid:durableId="268126374">
-    <w:abstractNumId w:val="1"/>
   </w:num>
 </w:numbering>
 </file>

</xml_diff>